<commit_message>
Switch badge template to black-and-white print
Co-Authored-By: Claude Opus 5.5 <noreply@anthropic.com>
Claude-Session: https://claude.ai/code/session_0149sWXEwDW8TGDudhT4YAQy
</commit_message>
<xml_diff>
--- a/badge/badge_zamestitel_uchitelya.docx
+++ b/badge/badge_zamestitel_uchitelya.docx
@@ -24,12 +24,12 @@
         <w:tblW w:type="dxa" w:w="10206"/>
         <w:jc w:val="center"/>
         <w:tblBorders>
-          <w:top w:val="dashed" w:color="9AA5B8" w:sz="4"/>
-          <w:left w:val="dashed" w:color="9AA5B8" w:sz="4"/>
-          <w:bottom w:val="dashed" w:color="9AA5B8" w:sz="4"/>
-          <w:right w:val="dashed" w:color="9AA5B8" w:sz="4"/>
-          <w:insideH w:val="dashed" w:color="9AA5B8" w:sz="4"/>
-          <w:insideV w:val="dashed" w:color="9AA5B8" w:sz="4"/>
+          <w:top w:val="dashed" w:color="808080" w:sz="4"/>
+          <w:left w:val="dashed" w:color="808080" w:sz="4"/>
+          <w:bottom w:val="dashed" w:color="808080" w:sz="4"/>
+          <w:right w:val="dashed" w:color="808080" w:sz="4"/>
+          <w:insideH w:val="dashed" w:color="808080" w:sz="4"/>
+          <w:insideV w:val="dashed" w:color="808080" w:sz="4"/>
         </w:tblBorders>
         <w:tblLayout w:type="fixed"/>
       </w:tblPr>
@@ -47,10 +47,10 @@
           <w:tcPr>
             <w:tcW w:type="dxa" w:w="3402"/>
             <w:tcBorders>
-              <w:top w:val="dashed" w:color="9AA5B8" w:sz="4"/>
-              <w:left w:val="dashed" w:color="9AA5B8" w:sz="4"/>
-              <w:bottom w:val="dashed" w:color="9AA5B8" w:sz="4"/>
-              <w:right w:val="dashed" w:color="9AA5B8" w:sz="4"/>
+              <w:top w:val="dashed" w:color="808080" w:sz="4"/>
+              <w:left w:val="dashed" w:color="808080" w:sz="4"/>
+              <w:bottom w:val="dashed" w:color="808080" w:sz="4"/>
+              <w:right w:val="dashed" w:color="808080" w:sz="4"/>
             </w:tcBorders>
             <w:tcMar>
               <w:top w:type="dxa" w:w="170"/>
@@ -84,7 +84,7 @@
               <w:tc>
                 <w:tcPr>
                   <w:tcW w:type="dxa" w:w="3119"/>
-                  <w:shd w:fill="14306E" w:color="auto" w:val="clear"/>
+                  <w:shd w:fill="000000" w:color="auto" w:val="clear"/>
                   <w:tcMar>
                     <w:top w:type="dxa" w:w="0"/>
                     <w:left w:type="dxa" w:w="85"/>
@@ -118,7 +118,7 @@
                   <w:r>
                     <w:rPr>
                       <w:rFonts w:ascii="Arial" w:cs="Arial" w:eastAsia="Arial" w:hAnsi="Arial"/>
-                      <w:color w:val="C9D8F5"/>
+                      <w:color w:val="FFFFFF"/>
                       <w:sz w:val="14"/>
                       <w:szCs w:val="14"/>
                     </w:rPr>
@@ -135,26 +135,26 @@
               <w:tc>
                 <w:tcPr>
                   <w:tcW w:type="dxa" w:w="3119"/>
-                  <w:shd w:fill="E6EEFB" w:color="auto" w:val="clear"/>
-                  <w:tcMar>
-                    <w:top w:type="dxa" w:w="0"/>
-                    <w:left w:type="dxa" w:w="85"/>
-                    <w:bottom w:type="dxa" w:w="0"/>
-                    <w:right w:type="dxa" w:w="85"/>
-                  </w:tcMar>
-                  <w:vAlign w:val="center"/>
-                </w:tcPr>
-                <w:p>
-                  <w:pPr>
-                    <w:spacing w:after="0" w:before="0" w:line="240"/>
-                    <w:jc w:val="center"/>
-                  </w:pPr>
-                  <w:r>
-                    <w:rPr>
-                      <w:rFonts w:ascii="Arial" w:cs="Arial" w:eastAsia="Arial" w:hAnsi="Arial"/>
-                      <w:b/>
-                      <w:bCs/>
-                      <w:color w:val="14306E"/>
+                  <w:shd w:fill="E0E0E0" w:color="auto" w:val="clear"/>
+                  <w:tcMar>
+                    <w:top w:type="dxa" w:w="0"/>
+                    <w:left w:type="dxa" w:w="85"/>
+                    <w:bottom w:type="dxa" w:w="0"/>
+                    <w:right w:type="dxa" w:w="85"/>
+                  </w:tcMar>
+                  <w:vAlign w:val="center"/>
+                </w:tcPr>
+                <w:p>
+                  <w:pPr>
+                    <w:spacing w:after="0" w:before="0" w:line="240"/>
+                    <w:jc w:val="center"/>
+                  </w:pPr>
+                  <w:r>
+                    <w:rPr>
+                      <w:rFonts w:ascii="Arial" w:cs="Arial" w:eastAsia="Arial" w:hAnsi="Arial"/>
+                      <w:b/>
+                      <w:bCs/>
+                      <w:color w:val="000000"/>
                       <w:sz w:val="26"/>
                       <w:szCs w:val="26"/>
                     </w:rPr>
@@ -171,7 +171,7 @@
                       <w:rFonts w:ascii="Arial" w:cs="Arial" w:eastAsia="Arial" w:hAnsi="Arial"/>
                       <w:b/>
                       <w:bCs/>
-                      <w:color w:val="14306E"/>
+                      <w:color w:val="000000"/>
                       <w:sz w:val="26"/>
                       <w:szCs w:val="26"/>
                     </w:rPr>
@@ -189,9 +189,9 @@
                 <w:tcPr>
                   <w:tcW w:type="dxa" w:w="3119"/>
                   <w:tcBorders>
-                    <w:top w:val="single" w:color="2B59C3" w:sz="6"/>
+                    <w:top w:val="single" w:color="000000" w:sz="12"/>
                     <w:left w:val="none" w:color="FFFFFF" w:sz="0"/>
-                    <w:bottom w:val="single" w:color="2B59C3" w:sz="6"/>
+                    <w:bottom w:val="single" w:color="000000" w:sz="12"/>
                     <w:right w:val="none" w:color="FFFFFF" w:sz="0"/>
                   </w:tcBorders>
                   <w:tcMar>
@@ -262,7 +262,7 @@
                   <w:r>
                     <w:rPr>
                       <w:rFonts w:ascii="Arial" w:cs="Arial" w:eastAsia="Arial" w:hAnsi="Arial"/>
-                      <w:color w:val="555555"/>
+                      <w:color w:val="333333"/>
                       <w:sz w:val="17"/>
                       <w:szCs w:val="17"/>
                     </w:rPr>
@@ -286,7 +286,7 @@
                   <w:r>
                     <w:rPr>
                       <w:rFonts w:ascii="Arial" w:cs="Arial" w:eastAsia="Arial" w:hAnsi="Arial"/>
-                      <w:color w:val="555555"/>
+                      <w:color w:val="333333"/>
                       <w:sz w:val="17"/>
                       <w:szCs w:val="17"/>
                     </w:rPr>
@@ -312,26 +312,31 @@
               <w:tc>
                 <w:tcPr>
                   <w:tcW w:type="dxa" w:w="3119"/>
-                  <w:shd w:fill="2B59C3" w:color="auto" w:val="clear"/>
-                  <w:tcMar>
-                    <w:top w:type="dxa" w:w="0"/>
-                    <w:left w:type="dxa" w:w="85"/>
-                    <w:bottom w:type="dxa" w:w="0"/>
-                    <w:right w:type="dxa" w:w="85"/>
-                  </w:tcMar>
-                  <w:vAlign w:val="center"/>
-                </w:tcPr>
-                <w:p>
-                  <w:pPr>
-                    <w:spacing w:after="0" w:before="0" w:line="240"/>
-                    <w:jc w:val="center"/>
-                  </w:pPr>
-                  <w:r>
-                    <w:rPr>
-                      <w:rFonts w:ascii="Arial" w:cs="Arial" w:eastAsia="Arial" w:hAnsi="Arial"/>
-                      <w:b/>
-                      <w:bCs/>
-                      <w:color w:val="FFFFFF"/>
+                  <w:tcBorders>
+                    <w:top w:val="single" w:color="000000" w:sz="12"/>
+                    <w:left w:val="none" w:color="FFFFFF" w:sz="0"/>
+                    <w:bottom w:val="none" w:color="FFFFFF" w:sz="0"/>
+                    <w:right w:val="none" w:color="FFFFFF" w:sz="0"/>
+                  </w:tcBorders>
+                  <w:tcMar>
+                    <w:top w:type="dxa" w:w="0"/>
+                    <w:left w:type="dxa" w:w="85"/>
+                    <w:bottom w:type="dxa" w:w="0"/>
+                    <w:right w:type="dxa" w:w="85"/>
+                  </w:tcMar>
+                  <w:vAlign w:val="center"/>
+                </w:tcPr>
+                <w:p>
+                  <w:pPr>
+                    <w:spacing w:after="0" w:before="0" w:line="240"/>
+                    <w:jc w:val="center"/>
+                  </w:pPr>
+                  <w:r>
+                    <w:rPr>
+                      <w:rFonts w:ascii="Arial" w:cs="Arial" w:eastAsia="Arial" w:hAnsi="Arial"/>
+                      <w:b/>
+                      <w:bCs/>
+                      <w:color w:val="000000"/>
                       <w:sz w:val="16"/>
                       <w:szCs w:val="16"/>
                     </w:rPr>
@@ -360,10 +365,10 @@
           <w:tcPr>
             <w:tcW w:type="dxa" w:w="3402"/>
             <w:tcBorders>
-              <w:top w:val="dashed" w:color="9AA5B8" w:sz="4"/>
-              <w:left w:val="dashed" w:color="9AA5B8" w:sz="4"/>
-              <w:bottom w:val="dashed" w:color="9AA5B8" w:sz="4"/>
-              <w:right w:val="dashed" w:color="9AA5B8" w:sz="4"/>
+              <w:top w:val="dashed" w:color="808080" w:sz="4"/>
+              <w:left w:val="dashed" w:color="808080" w:sz="4"/>
+              <w:bottom w:val="dashed" w:color="808080" w:sz="4"/>
+              <w:right w:val="dashed" w:color="808080" w:sz="4"/>
             </w:tcBorders>
             <w:tcMar>
               <w:top w:type="dxa" w:w="170"/>
@@ -397,7 +402,7 @@
               <w:tc>
                 <w:tcPr>
                   <w:tcW w:type="dxa" w:w="3119"/>
-                  <w:shd w:fill="14306E" w:color="auto" w:val="clear"/>
+                  <w:shd w:fill="000000" w:color="auto" w:val="clear"/>
                   <w:tcMar>
                     <w:top w:type="dxa" w:w="0"/>
                     <w:left w:type="dxa" w:w="85"/>
@@ -431,7 +436,7 @@
                   <w:r>
                     <w:rPr>
                       <w:rFonts w:ascii="Arial" w:cs="Arial" w:eastAsia="Arial" w:hAnsi="Arial"/>
-                      <w:color w:val="C9D8F5"/>
+                      <w:color w:val="FFFFFF"/>
                       <w:sz w:val="14"/>
                       <w:szCs w:val="14"/>
                     </w:rPr>
@@ -448,26 +453,26 @@
               <w:tc>
                 <w:tcPr>
                   <w:tcW w:type="dxa" w:w="3119"/>
-                  <w:shd w:fill="E6EEFB" w:color="auto" w:val="clear"/>
-                  <w:tcMar>
-                    <w:top w:type="dxa" w:w="0"/>
-                    <w:left w:type="dxa" w:w="85"/>
-                    <w:bottom w:type="dxa" w:w="0"/>
-                    <w:right w:type="dxa" w:w="85"/>
-                  </w:tcMar>
-                  <w:vAlign w:val="center"/>
-                </w:tcPr>
-                <w:p>
-                  <w:pPr>
-                    <w:spacing w:after="0" w:before="0" w:line="240"/>
-                    <w:jc w:val="center"/>
-                  </w:pPr>
-                  <w:r>
-                    <w:rPr>
-                      <w:rFonts w:ascii="Arial" w:cs="Arial" w:eastAsia="Arial" w:hAnsi="Arial"/>
-                      <w:b/>
-                      <w:bCs/>
-                      <w:color w:val="14306E"/>
+                  <w:shd w:fill="E0E0E0" w:color="auto" w:val="clear"/>
+                  <w:tcMar>
+                    <w:top w:type="dxa" w:w="0"/>
+                    <w:left w:type="dxa" w:w="85"/>
+                    <w:bottom w:type="dxa" w:w="0"/>
+                    <w:right w:type="dxa" w:w="85"/>
+                  </w:tcMar>
+                  <w:vAlign w:val="center"/>
+                </w:tcPr>
+                <w:p>
+                  <w:pPr>
+                    <w:spacing w:after="0" w:before="0" w:line="240"/>
+                    <w:jc w:val="center"/>
+                  </w:pPr>
+                  <w:r>
+                    <w:rPr>
+                      <w:rFonts w:ascii="Arial" w:cs="Arial" w:eastAsia="Arial" w:hAnsi="Arial"/>
+                      <w:b/>
+                      <w:bCs/>
+                      <w:color w:val="000000"/>
                       <w:sz w:val="26"/>
                       <w:szCs w:val="26"/>
                     </w:rPr>
@@ -484,7 +489,7 @@
                       <w:rFonts w:ascii="Arial" w:cs="Arial" w:eastAsia="Arial" w:hAnsi="Arial"/>
                       <w:b/>
                       <w:bCs/>
-                      <w:color w:val="14306E"/>
+                      <w:color w:val="000000"/>
                       <w:sz w:val="26"/>
                       <w:szCs w:val="26"/>
                     </w:rPr>
@@ -502,9 +507,9 @@
                 <w:tcPr>
                   <w:tcW w:type="dxa" w:w="3119"/>
                   <w:tcBorders>
-                    <w:top w:val="single" w:color="2B59C3" w:sz="6"/>
+                    <w:top w:val="single" w:color="000000" w:sz="12"/>
                     <w:left w:val="none" w:color="FFFFFF" w:sz="0"/>
-                    <w:bottom w:val="single" w:color="2B59C3" w:sz="6"/>
+                    <w:bottom w:val="single" w:color="000000" w:sz="12"/>
                     <w:right w:val="none" w:color="FFFFFF" w:sz="0"/>
                   </w:tcBorders>
                   <w:tcMar>
@@ -575,7 +580,7 @@
                   <w:r>
                     <w:rPr>
                       <w:rFonts w:ascii="Arial" w:cs="Arial" w:eastAsia="Arial" w:hAnsi="Arial"/>
-                      <w:color w:val="555555"/>
+                      <w:color w:val="333333"/>
                       <w:sz w:val="17"/>
                       <w:szCs w:val="17"/>
                     </w:rPr>
@@ -599,7 +604,7 @@
                   <w:r>
                     <w:rPr>
                       <w:rFonts w:ascii="Arial" w:cs="Arial" w:eastAsia="Arial" w:hAnsi="Arial"/>
-                      <w:color w:val="555555"/>
+                      <w:color w:val="333333"/>
                       <w:sz w:val="17"/>
                       <w:szCs w:val="17"/>
                     </w:rPr>
@@ -625,26 +630,31 @@
               <w:tc>
                 <w:tcPr>
                   <w:tcW w:type="dxa" w:w="3119"/>
-                  <w:shd w:fill="2B59C3" w:color="auto" w:val="clear"/>
-                  <w:tcMar>
-                    <w:top w:type="dxa" w:w="0"/>
-                    <w:left w:type="dxa" w:w="85"/>
-                    <w:bottom w:type="dxa" w:w="0"/>
-                    <w:right w:type="dxa" w:w="85"/>
-                  </w:tcMar>
-                  <w:vAlign w:val="center"/>
-                </w:tcPr>
-                <w:p>
-                  <w:pPr>
-                    <w:spacing w:after="0" w:before="0" w:line="240"/>
-                    <w:jc w:val="center"/>
-                  </w:pPr>
-                  <w:r>
-                    <w:rPr>
-                      <w:rFonts w:ascii="Arial" w:cs="Arial" w:eastAsia="Arial" w:hAnsi="Arial"/>
-                      <w:b/>
-                      <w:bCs/>
-                      <w:color w:val="FFFFFF"/>
+                  <w:tcBorders>
+                    <w:top w:val="single" w:color="000000" w:sz="12"/>
+                    <w:left w:val="none" w:color="FFFFFF" w:sz="0"/>
+                    <w:bottom w:val="none" w:color="FFFFFF" w:sz="0"/>
+                    <w:right w:val="none" w:color="FFFFFF" w:sz="0"/>
+                  </w:tcBorders>
+                  <w:tcMar>
+                    <w:top w:type="dxa" w:w="0"/>
+                    <w:left w:type="dxa" w:w="85"/>
+                    <w:bottom w:type="dxa" w:w="0"/>
+                    <w:right w:type="dxa" w:w="85"/>
+                  </w:tcMar>
+                  <w:vAlign w:val="center"/>
+                </w:tcPr>
+                <w:p>
+                  <w:pPr>
+                    <w:spacing w:after="0" w:before="0" w:line="240"/>
+                    <w:jc w:val="center"/>
+                  </w:pPr>
+                  <w:r>
+                    <w:rPr>
+                      <w:rFonts w:ascii="Arial" w:cs="Arial" w:eastAsia="Arial" w:hAnsi="Arial"/>
+                      <w:b/>
+                      <w:bCs/>
+                      <w:color w:val="000000"/>
                       <w:sz w:val="16"/>
                       <w:szCs w:val="16"/>
                     </w:rPr>
@@ -673,10 +683,10 @@
           <w:tcPr>
             <w:tcW w:type="dxa" w:w="3402"/>
             <w:tcBorders>
-              <w:top w:val="dashed" w:color="9AA5B8" w:sz="4"/>
-              <w:left w:val="dashed" w:color="9AA5B8" w:sz="4"/>
-              <w:bottom w:val="dashed" w:color="9AA5B8" w:sz="4"/>
-              <w:right w:val="dashed" w:color="9AA5B8" w:sz="4"/>
+              <w:top w:val="dashed" w:color="808080" w:sz="4"/>
+              <w:left w:val="dashed" w:color="808080" w:sz="4"/>
+              <w:bottom w:val="dashed" w:color="808080" w:sz="4"/>
+              <w:right w:val="dashed" w:color="808080" w:sz="4"/>
             </w:tcBorders>
             <w:tcMar>
               <w:top w:type="dxa" w:w="170"/>
@@ -710,7 +720,7 @@
               <w:tc>
                 <w:tcPr>
                   <w:tcW w:type="dxa" w:w="3119"/>
-                  <w:shd w:fill="14306E" w:color="auto" w:val="clear"/>
+                  <w:shd w:fill="000000" w:color="auto" w:val="clear"/>
                   <w:tcMar>
                     <w:top w:type="dxa" w:w="0"/>
                     <w:left w:type="dxa" w:w="85"/>
@@ -744,7 +754,7 @@
                   <w:r>
                     <w:rPr>
                       <w:rFonts w:ascii="Arial" w:cs="Arial" w:eastAsia="Arial" w:hAnsi="Arial"/>
-                      <w:color w:val="C9D8F5"/>
+                      <w:color w:val="FFFFFF"/>
                       <w:sz w:val="14"/>
                       <w:szCs w:val="14"/>
                     </w:rPr>
@@ -761,26 +771,26 @@
               <w:tc>
                 <w:tcPr>
                   <w:tcW w:type="dxa" w:w="3119"/>
-                  <w:shd w:fill="E6EEFB" w:color="auto" w:val="clear"/>
-                  <w:tcMar>
-                    <w:top w:type="dxa" w:w="0"/>
-                    <w:left w:type="dxa" w:w="85"/>
-                    <w:bottom w:type="dxa" w:w="0"/>
-                    <w:right w:type="dxa" w:w="85"/>
-                  </w:tcMar>
-                  <w:vAlign w:val="center"/>
-                </w:tcPr>
-                <w:p>
-                  <w:pPr>
-                    <w:spacing w:after="0" w:before="0" w:line="240"/>
-                    <w:jc w:val="center"/>
-                  </w:pPr>
-                  <w:r>
-                    <w:rPr>
-                      <w:rFonts w:ascii="Arial" w:cs="Arial" w:eastAsia="Arial" w:hAnsi="Arial"/>
-                      <w:b/>
-                      <w:bCs/>
-                      <w:color w:val="14306E"/>
+                  <w:shd w:fill="E0E0E0" w:color="auto" w:val="clear"/>
+                  <w:tcMar>
+                    <w:top w:type="dxa" w:w="0"/>
+                    <w:left w:type="dxa" w:w="85"/>
+                    <w:bottom w:type="dxa" w:w="0"/>
+                    <w:right w:type="dxa" w:w="85"/>
+                  </w:tcMar>
+                  <w:vAlign w:val="center"/>
+                </w:tcPr>
+                <w:p>
+                  <w:pPr>
+                    <w:spacing w:after="0" w:before="0" w:line="240"/>
+                    <w:jc w:val="center"/>
+                  </w:pPr>
+                  <w:r>
+                    <w:rPr>
+                      <w:rFonts w:ascii="Arial" w:cs="Arial" w:eastAsia="Arial" w:hAnsi="Arial"/>
+                      <w:b/>
+                      <w:bCs/>
+                      <w:color w:val="000000"/>
                       <w:sz w:val="26"/>
                       <w:szCs w:val="26"/>
                     </w:rPr>
@@ -797,7 +807,7 @@
                       <w:rFonts w:ascii="Arial" w:cs="Arial" w:eastAsia="Arial" w:hAnsi="Arial"/>
                       <w:b/>
                       <w:bCs/>
-                      <w:color w:val="14306E"/>
+                      <w:color w:val="000000"/>
                       <w:sz w:val="26"/>
                       <w:szCs w:val="26"/>
                     </w:rPr>
@@ -815,9 +825,9 @@
                 <w:tcPr>
                   <w:tcW w:type="dxa" w:w="3119"/>
                   <w:tcBorders>
-                    <w:top w:val="single" w:color="2B59C3" w:sz="6"/>
+                    <w:top w:val="single" w:color="000000" w:sz="12"/>
                     <w:left w:val="none" w:color="FFFFFF" w:sz="0"/>
-                    <w:bottom w:val="single" w:color="2B59C3" w:sz="6"/>
+                    <w:bottom w:val="single" w:color="000000" w:sz="12"/>
                     <w:right w:val="none" w:color="FFFFFF" w:sz="0"/>
                   </w:tcBorders>
                   <w:tcMar>
@@ -888,7 +898,7 @@
                   <w:r>
                     <w:rPr>
                       <w:rFonts w:ascii="Arial" w:cs="Arial" w:eastAsia="Arial" w:hAnsi="Arial"/>
-                      <w:color w:val="555555"/>
+                      <w:color w:val="333333"/>
                       <w:sz w:val="17"/>
                       <w:szCs w:val="17"/>
                     </w:rPr>
@@ -912,7 +922,7 @@
                   <w:r>
                     <w:rPr>
                       <w:rFonts w:ascii="Arial" w:cs="Arial" w:eastAsia="Arial" w:hAnsi="Arial"/>
-                      <w:color w:val="555555"/>
+                      <w:color w:val="333333"/>
                       <w:sz w:val="17"/>
                       <w:szCs w:val="17"/>
                     </w:rPr>
@@ -938,26 +948,31 @@
               <w:tc>
                 <w:tcPr>
                   <w:tcW w:type="dxa" w:w="3119"/>
-                  <w:shd w:fill="2B59C3" w:color="auto" w:val="clear"/>
-                  <w:tcMar>
-                    <w:top w:type="dxa" w:w="0"/>
-                    <w:left w:type="dxa" w:w="85"/>
-                    <w:bottom w:type="dxa" w:w="0"/>
-                    <w:right w:type="dxa" w:w="85"/>
-                  </w:tcMar>
-                  <w:vAlign w:val="center"/>
-                </w:tcPr>
-                <w:p>
-                  <w:pPr>
-                    <w:spacing w:after="0" w:before="0" w:line="240"/>
-                    <w:jc w:val="center"/>
-                  </w:pPr>
-                  <w:r>
-                    <w:rPr>
-                      <w:rFonts w:ascii="Arial" w:cs="Arial" w:eastAsia="Arial" w:hAnsi="Arial"/>
-                      <w:b/>
-                      <w:bCs/>
-                      <w:color w:val="FFFFFF"/>
+                  <w:tcBorders>
+                    <w:top w:val="single" w:color="000000" w:sz="12"/>
+                    <w:left w:val="none" w:color="FFFFFF" w:sz="0"/>
+                    <w:bottom w:val="none" w:color="FFFFFF" w:sz="0"/>
+                    <w:right w:val="none" w:color="FFFFFF" w:sz="0"/>
+                  </w:tcBorders>
+                  <w:tcMar>
+                    <w:top w:type="dxa" w:w="0"/>
+                    <w:left w:type="dxa" w:w="85"/>
+                    <w:bottom w:type="dxa" w:w="0"/>
+                    <w:right w:type="dxa" w:w="85"/>
+                  </w:tcMar>
+                  <w:vAlign w:val="center"/>
+                </w:tcPr>
+                <w:p>
+                  <w:pPr>
+                    <w:spacing w:after="0" w:before="0" w:line="240"/>
+                    <w:jc w:val="center"/>
+                  </w:pPr>
+                  <w:r>
+                    <w:rPr>
+                      <w:rFonts w:ascii="Arial" w:cs="Arial" w:eastAsia="Arial" w:hAnsi="Arial"/>
+                      <w:b/>
+                      <w:bCs/>
+                      <w:color w:val="000000"/>
                       <w:sz w:val="16"/>
                       <w:szCs w:val="16"/>
                     </w:rPr>
@@ -992,10 +1007,10 @@
           <w:tcPr>
             <w:tcW w:type="dxa" w:w="3402"/>
             <w:tcBorders>
-              <w:top w:val="dashed" w:color="9AA5B8" w:sz="4"/>
-              <w:left w:val="dashed" w:color="9AA5B8" w:sz="4"/>
-              <w:bottom w:val="dashed" w:color="9AA5B8" w:sz="4"/>
-              <w:right w:val="dashed" w:color="9AA5B8" w:sz="4"/>
+              <w:top w:val="dashed" w:color="808080" w:sz="4"/>
+              <w:left w:val="dashed" w:color="808080" w:sz="4"/>
+              <w:bottom w:val="dashed" w:color="808080" w:sz="4"/>
+              <w:right w:val="dashed" w:color="808080" w:sz="4"/>
             </w:tcBorders>
             <w:tcMar>
               <w:top w:type="dxa" w:w="170"/>
@@ -1029,7 +1044,7 @@
               <w:tc>
                 <w:tcPr>
                   <w:tcW w:type="dxa" w:w="3119"/>
-                  <w:shd w:fill="14306E" w:color="auto" w:val="clear"/>
+                  <w:shd w:fill="000000" w:color="auto" w:val="clear"/>
                   <w:tcMar>
                     <w:top w:type="dxa" w:w="0"/>
                     <w:left w:type="dxa" w:w="85"/>
@@ -1063,7 +1078,7 @@
                   <w:r>
                     <w:rPr>
                       <w:rFonts w:ascii="Arial" w:cs="Arial" w:eastAsia="Arial" w:hAnsi="Arial"/>
-                      <w:color w:val="C9D8F5"/>
+                      <w:color w:val="FFFFFF"/>
                       <w:sz w:val="14"/>
                       <w:szCs w:val="14"/>
                     </w:rPr>
@@ -1080,26 +1095,26 @@
               <w:tc>
                 <w:tcPr>
                   <w:tcW w:type="dxa" w:w="3119"/>
-                  <w:shd w:fill="E6EEFB" w:color="auto" w:val="clear"/>
-                  <w:tcMar>
-                    <w:top w:type="dxa" w:w="0"/>
-                    <w:left w:type="dxa" w:w="85"/>
-                    <w:bottom w:type="dxa" w:w="0"/>
-                    <w:right w:type="dxa" w:w="85"/>
-                  </w:tcMar>
-                  <w:vAlign w:val="center"/>
-                </w:tcPr>
-                <w:p>
-                  <w:pPr>
-                    <w:spacing w:after="0" w:before="0" w:line="240"/>
-                    <w:jc w:val="center"/>
-                  </w:pPr>
-                  <w:r>
-                    <w:rPr>
-                      <w:rFonts w:ascii="Arial" w:cs="Arial" w:eastAsia="Arial" w:hAnsi="Arial"/>
-                      <w:b/>
-                      <w:bCs/>
-                      <w:color w:val="14306E"/>
+                  <w:shd w:fill="E0E0E0" w:color="auto" w:val="clear"/>
+                  <w:tcMar>
+                    <w:top w:type="dxa" w:w="0"/>
+                    <w:left w:type="dxa" w:w="85"/>
+                    <w:bottom w:type="dxa" w:w="0"/>
+                    <w:right w:type="dxa" w:w="85"/>
+                  </w:tcMar>
+                  <w:vAlign w:val="center"/>
+                </w:tcPr>
+                <w:p>
+                  <w:pPr>
+                    <w:spacing w:after="0" w:before="0" w:line="240"/>
+                    <w:jc w:val="center"/>
+                  </w:pPr>
+                  <w:r>
+                    <w:rPr>
+                      <w:rFonts w:ascii="Arial" w:cs="Arial" w:eastAsia="Arial" w:hAnsi="Arial"/>
+                      <w:b/>
+                      <w:bCs/>
+                      <w:color w:val="000000"/>
                       <w:sz w:val="26"/>
                       <w:szCs w:val="26"/>
                     </w:rPr>
@@ -1116,7 +1131,7 @@
                       <w:rFonts w:ascii="Arial" w:cs="Arial" w:eastAsia="Arial" w:hAnsi="Arial"/>
                       <w:b/>
                       <w:bCs/>
-                      <w:color w:val="14306E"/>
+                      <w:color w:val="000000"/>
                       <w:sz w:val="26"/>
                       <w:szCs w:val="26"/>
                     </w:rPr>
@@ -1134,9 +1149,9 @@
                 <w:tcPr>
                   <w:tcW w:type="dxa" w:w="3119"/>
                   <w:tcBorders>
-                    <w:top w:val="single" w:color="2B59C3" w:sz="6"/>
+                    <w:top w:val="single" w:color="000000" w:sz="12"/>
                     <w:left w:val="none" w:color="FFFFFF" w:sz="0"/>
-                    <w:bottom w:val="single" w:color="2B59C3" w:sz="6"/>
+                    <w:bottom w:val="single" w:color="000000" w:sz="12"/>
                     <w:right w:val="none" w:color="FFFFFF" w:sz="0"/>
                   </w:tcBorders>
                   <w:tcMar>
@@ -1207,7 +1222,7 @@
                   <w:r>
                     <w:rPr>
                       <w:rFonts w:ascii="Arial" w:cs="Arial" w:eastAsia="Arial" w:hAnsi="Arial"/>
-                      <w:color w:val="555555"/>
+                      <w:color w:val="333333"/>
                       <w:sz w:val="17"/>
                       <w:szCs w:val="17"/>
                     </w:rPr>
@@ -1231,7 +1246,7 @@
                   <w:r>
                     <w:rPr>
                       <w:rFonts w:ascii="Arial" w:cs="Arial" w:eastAsia="Arial" w:hAnsi="Arial"/>
-                      <w:color w:val="555555"/>
+                      <w:color w:val="333333"/>
                       <w:sz w:val="17"/>
                       <w:szCs w:val="17"/>
                     </w:rPr>
@@ -1257,26 +1272,31 @@
               <w:tc>
                 <w:tcPr>
                   <w:tcW w:type="dxa" w:w="3119"/>
-                  <w:shd w:fill="2B59C3" w:color="auto" w:val="clear"/>
-                  <w:tcMar>
-                    <w:top w:type="dxa" w:w="0"/>
-                    <w:left w:type="dxa" w:w="85"/>
-                    <w:bottom w:type="dxa" w:w="0"/>
-                    <w:right w:type="dxa" w:w="85"/>
-                  </w:tcMar>
-                  <w:vAlign w:val="center"/>
-                </w:tcPr>
-                <w:p>
-                  <w:pPr>
-                    <w:spacing w:after="0" w:before="0" w:line="240"/>
-                    <w:jc w:val="center"/>
-                  </w:pPr>
-                  <w:r>
-                    <w:rPr>
-                      <w:rFonts w:ascii="Arial" w:cs="Arial" w:eastAsia="Arial" w:hAnsi="Arial"/>
-                      <w:b/>
-                      <w:bCs/>
-                      <w:color w:val="FFFFFF"/>
+                  <w:tcBorders>
+                    <w:top w:val="single" w:color="000000" w:sz="12"/>
+                    <w:left w:val="none" w:color="FFFFFF" w:sz="0"/>
+                    <w:bottom w:val="none" w:color="FFFFFF" w:sz="0"/>
+                    <w:right w:val="none" w:color="FFFFFF" w:sz="0"/>
+                  </w:tcBorders>
+                  <w:tcMar>
+                    <w:top w:type="dxa" w:w="0"/>
+                    <w:left w:type="dxa" w:w="85"/>
+                    <w:bottom w:type="dxa" w:w="0"/>
+                    <w:right w:type="dxa" w:w="85"/>
+                  </w:tcMar>
+                  <w:vAlign w:val="center"/>
+                </w:tcPr>
+                <w:p>
+                  <w:pPr>
+                    <w:spacing w:after="0" w:before="0" w:line="240"/>
+                    <w:jc w:val="center"/>
+                  </w:pPr>
+                  <w:r>
+                    <w:rPr>
+                      <w:rFonts w:ascii="Arial" w:cs="Arial" w:eastAsia="Arial" w:hAnsi="Arial"/>
+                      <w:b/>
+                      <w:bCs/>
+                      <w:color w:val="000000"/>
                       <w:sz w:val="16"/>
                       <w:szCs w:val="16"/>
                     </w:rPr>
@@ -1305,10 +1325,10 @@
           <w:tcPr>
             <w:tcW w:type="dxa" w:w="3402"/>
             <w:tcBorders>
-              <w:top w:val="dashed" w:color="9AA5B8" w:sz="4"/>
-              <w:left w:val="dashed" w:color="9AA5B8" w:sz="4"/>
-              <w:bottom w:val="dashed" w:color="9AA5B8" w:sz="4"/>
-              <w:right w:val="dashed" w:color="9AA5B8" w:sz="4"/>
+              <w:top w:val="dashed" w:color="808080" w:sz="4"/>
+              <w:left w:val="dashed" w:color="808080" w:sz="4"/>
+              <w:bottom w:val="dashed" w:color="808080" w:sz="4"/>
+              <w:right w:val="dashed" w:color="808080" w:sz="4"/>
             </w:tcBorders>
             <w:tcMar>
               <w:top w:type="dxa" w:w="170"/>
@@ -1342,7 +1362,7 @@
               <w:tc>
                 <w:tcPr>
                   <w:tcW w:type="dxa" w:w="3119"/>
-                  <w:shd w:fill="14306E" w:color="auto" w:val="clear"/>
+                  <w:shd w:fill="000000" w:color="auto" w:val="clear"/>
                   <w:tcMar>
                     <w:top w:type="dxa" w:w="0"/>
                     <w:left w:type="dxa" w:w="85"/>
@@ -1376,7 +1396,7 @@
                   <w:r>
                     <w:rPr>
                       <w:rFonts w:ascii="Arial" w:cs="Arial" w:eastAsia="Arial" w:hAnsi="Arial"/>
-                      <w:color w:val="C9D8F5"/>
+                      <w:color w:val="FFFFFF"/>
                       <w:sz w:val="14"/>
                       <w:szCs w:val="14"/>
                     </w:rPr>
@@ -1393,26 +1413,26 @@
               <w:tc>
                 <w:tcPr>
                   <w:tcW w:type="dxa" w:w="3119"/>
-                  <w:shd w:fill="E6EEFB" w:color="auto" w:val="clear"/>
-                  <w:tcMar>
-                    <w:top w:type="dxa" w:w="0"/>
-                    <w:left w:type="dxa" w:w="85"/>
-                    <w:bottom w:type="dxa" w:w="0"/>
-                    <w:right w:type="dxa" w:w="85"/>
-                  </w:tcMar>
-                  <w:vAlign w:val="center"/>
-                </w:tcPr>
-                <w:p>
-                  <w:pPr>
-                    <w:spacing w:after="0" w:before="0" w:line="240"/>
-                    <w:jc w:val="center"/>
-                  </w:pPr>
-                  <w:r>
-                    <w:rPr>
-                      <w:rFonts w:ascii="Arial" w:cs="Arial" w:eastAsia="Arial" w:hAnsi="Arial"/>
-                      <w:b/>
-                      <w:bCs/>
-                      <w:color w:val="14306E"/>
+                  <w:shd w:fill="E0E0E0" w:color="auto" w:val="clear"/>
+                  <w:tcMar>
+                    <w:top w:type="dxa" w:w="0"/>
+                    <w:left w:type="dxa" w:w="85"/>
+                    <w:bottom w:type="dxa" w:w="0"/>
+                    <w:right w:type="dxa" w:w="85"/>
+                  </w:tcMar>
+                  <w:vAlign w:val="center"/>
+                </w:tcPr>
+                <w:p>
+                  <w:pPr>
+                    <w:spacing w:after="0" w:before="0" w:line="240"/>
+                    <w:jc w:val="center"/>
+                  </w:pPr>
+                  <w:r>
+                    <w:rPr>
+                      <w:rFonts w:ascii="Arial" w:cs="Arial" w:eastAsia="Arial" w:hAnsi="Arial"/>
+                      <w:b/>
+                      <w:bCs/>
+                      <w:color w:val="000000"/>
                       <w:sz w:val="26"/>
                       <w:szCs w:val="26"/>
                     </w:rPr>
@@ -1429,7 +1449,7 @@
                       <w:rFonts w:ascii="Arial" w:cs="Arial" w:eastAsia="Arial" w:hAnsi="Arial"/>
                       <w:b/>
                       <w:bCs/>
-                      <w:color w:val="14306E"/>
+                      <w:color w:val="000000"/>
                       <w:sz w:val="26"/>
                       <w:szCs w:val="26"/>
                     </w:rPr>
@@ -1447,9 +1467,9 @@
                 <w:tcPr>
                   <w:tcW w:type="dxa" w:w="3119"/>
                   <w:tcBorders>
-                    <w:top w:val="single" w:color="2B59C3" w:sz="6"/>
+                    <w:top w:val="single" w:color="000000" w:sz="12"/>
                     <w:left w:val="none" w:color="FFFFFF" w:sz="0"/>
-                    <w:bottom w:val="single" w:color="2B59C3" w:sz="6"/>
+                    <w:bottom w:val="single" w:color="000000" w:sz="12"/>
                     <w:right w:val="none" w:color="FFFFFF" w:sz="0"/>
                   </w:tcBorders>
                   <w:tcMar>
@@ -1520,7 +1540,7 @@
                   <w:r>
                     <w:rPr>
                       <w:rFonts w:ascii="Arial" w:cs="Arial" w:eastAsia="Arial" w:hAnsi="Arial"/>
-                      <w:color w:val="555555"/>
+                      <w:color w:val="333333"/>
                       <w:sz w:val="17"/>
                       <w:szCs w:val="17"/>
                     </w:rPr>
@@ -1544,7 +1564,7 @@
                   <w:r>
                     <w:rPr>
                       <w:rFonts w:ascii="Arial" w:cs="Arial" w:eastAsia="Arial" w:hAnsi="Arial"/>
-                      <w:color w:val="555555"/>
+                      <w:color w:val="333333"/>
                       <w:sz w:val="17"/>
                       <w:szCs w:val="17"/>
                     </w:rPr>
@@ -1570,26 +1590,31 @@
               <w:tc>
                 <w:tcPr>
                   <w:tcW w:type="dxa" w:w="3119"/>
-                  <w:shd w:fill="2B59C3" w:color="auto" w:val="clear"/>
-                  <w:tcMar>
-                    <w:top w:type="dxa" w:w="0"/>
-                    <w:left w:type="dxa" w:w="85"/>
-                    <w:bottom w:type="dxa" w:w="0"/>
-                    <w:right w:type="dxa" w:w="85"/>
-                  </w:tcMar>
-                  <w:vAlign w:val="center"/>
-                </w:tcPr>
-                <w:p>
-                  <w:pPr>
-                    <w:spacing w:after="0" w:before="0" w:line="240"/>
-                    <w:jc w:val="center"/>
-                  </w:pPr>
-                  <w:r>
-                    <w:rPr>
-                      <w:rFonts w:ascii="Arial" w:cs="Arial" w:eastAsia="Arial" w:hAnsi="Arial"/>
-                      <w:b/>
-                      <w:bCs/>
-                      <w:color w:val="FFFFFF"/>
+                  <w:tcBorders>
+                    <w:top w:val="single" w:color="000000" w:sz="12"/>
+                    <w:left w:val="none" w:color="FFFFFF" w:sz="0"/>
+                    <w:bottom w:val="none" w:color="FFFFFF" w:sz="0"/>
+                    <w:right w:val="none" w:color="FFFFFF" w:sz="0"/>
+                  </w:tcBorders>
+                  <w:tcMar>
+                    <w:top w:type="dxa" w:w="0"/>
+                    <w:left w:type="dxa" w:w="85"/>
+                    <w:bottom w:type="dxa" w:w="0"/>
+                    <w:right w:type="dxa" w:w="85"/>
+                  </w:tcMar>
+                  <w:vAlign w:val="center"/>
+                </w:tcPr>
+                <w:p>
+                  <w:pPr>
+                    <w:spacing w:after="0" w:before="0" w:line="240"/>
+                    <w:jc w:val="center"/>
+                  </w:pPr>
+                  <w:r>
+                    <w:rPr>
+                      <w:rFonts w:ascii="Arial" w:cs="Arial" w:eastAsia="Arial" w:hAnsi="Arial"/>
+                      <w:b/>
+                      <w:bCs/>
+                      <w:color w:val="000000"/>
                       <w:sz w:val="16"/>
                       <w:szCs w:val="16"/>
                     </w:rPr>
@@ -1618,10 +1643,10 @@
           <w:tcPr>
             <w:tcW w:type="dxa" w:w="3402"/>
             <w:tcBorders>
-              <w:top w:val="dashed" w:color="9AA5B8" w:sz="4"/>
-              <w:left w:val="dashed" w:color="9AA5B8" w:sz="4"/>
-              <w:bottom w:val="dashed" w:color="9AA5B8" w:sz="4"/>
-              <w:right w:val="dashed" w:color="9AA5B8" w:sz="4"/>
+              <w:top w:val="dashed" w:color="808080" w:sz="4"/>
+              <w:left w:val="dashed" w:color="808080" w:sz="4"/>
+              <w:bottom w:val="dashed" w:color="808080" w:sz="4"/>
+              <w:right w:val="dashed" w:color="808080" w:sz="4"/>
             </w:tcBorders>
             <w:tcMar>
               <w:top w:type="dxa" w:w="170"/>
@@ -1655,7 +1680,7 @@
               <w:tc>
                 <w:tcPr>
                   <w:tcW w:type="dxa" w:w="3119"/>
-                  <w:shd w:fill="14306E" w:color="auto" w:val="clear"/>
+                  <w:shd w:fill="000000" w:color="auto" w:val="clear"/>
                   <w:tcMar>
                     <w:top w:type="dxa" w:w="0"/>
                     <w:left w:type="dxa" w:w="85"/>
@@ -1689,7 +1714,7 @@
                   <w:r>
                     <w:rPr>
                       <w:rFonts w:ascii="Arial" w:cs="Arial" w:eastAsia="Arial" w:hAnsi="Arial"/>
-                      <w:color w:val="C9D8F5"/>
+                      <w:color w:val="FFFFFF"/>
                       <w:sz w:val="14"/>
                       <w:szCs w:val="14"/>
                     </w:rPr>
@@ -1706,26 +1731,26 @@
               <w:tc>
                 <w:tcPr>
                   <w:tcW w:type="dxa" w:w="3119"/>
-                  <w:shd w:fill="E6EEFB" w:color="auto" w:val="clear"/>
-                  <w:tcMar>
-                    <w:top w:type="dxa" w:w="0"/>
-                    <w:left w:type="dxa" w:w="85"/>
-                    <w:bottom w:type="dxa" w:w="0"/>
-                    <w:right w:type="dxa" w:w="85"/>
-                  </w:tcMar>
-                  <w:vAlign w:val="center"/>
-                </w:tcPr>
-                <w:p>
-                  <w:pPr>
-                    <w:spacing w:after="0" w:before="0" w:line="240"/>
-                    <w:jc w:val="center"/>
-                  </w:pPr>
-                  <w:r>
-                    <w:rPr>
-                      <w:rFonts w:ascii="Arial" w:cs="Arial" w:eastAsia="Arial" w:hAnsi="Arial"/>
-                      <w:b/>
-                      <w:bCs/>
-                      <w:color w:val="14306E"/>
+                  <w:shd w:fill="E0E0E0" w:color="auto" w:val="clear"/>
+                  <w:tcMar>
+                    <w:top w:type="dxa" w:w="0"/>
+                    <w:left w:type="dxa" w:w="85"/>
+                    <w:bottom w:type="dxa" w:w="0"/>
+                    <w:right w:type="dxa" w:w="85"/>
+                  </w:tcMar>
+                  <w:vAlign w:val="center"/>
+                </w:tcPr>
+                <w:p>
+                  <w:pPr>
+                    <w:spacing w:after="0" w:before="0" w:line="240"/>
+                    <w:jc w:val="center"/>
+                  </w:pPr>
+                  <w:r>
+                    <w:rPr>
+                      <w:rFonts w:ascii="Arial" w:cs="Arial" w:eastAsia="Arial" w:hAnsi="Arial"/>
+                      <w:b/>
+                      <w:bCs/>
+                      <w:color w:val="000000"/>
                       <w:sz w:val="26"/>
                       <w:szCs w:val="26"/>
                     </w:rPr>
@@ -1742,7 +1767,7 @@
                       <w:rFonts w:ascii="Arial" w:cs="Arial" w:eastAsia="Arial" w:hAnsi="Arial"/>
                       <w:b/>
                       <w:bCs/>
-                      <w:color w:val="14306E"/>
+                      <w:color w:val="000000"/>
                       <w:sz w:val="26"/>
                       <w:szCs w:val="26"/>
                     </w:rPr>
@@ -1760,9 +1785,9 @@
                 <w:tcPr>
                   <w:tcW w:type="dxa" w:w="3119"/>
                   <w:tcBorders>
-                    <w:top w:val="single" w:color="2B59C3" w:sz="6"/>
+                    <w:top w:val="single" w:color="000000" w:sz="12"/>
                     <w:left w:val="none" w:color="FFFFFF" w:sz="0"/>
-                    <w:bottom w:val="single" w:color="2B59C3" w:sz="6"/>
+                    <w:bottom w:val="single" w:color="000000" w:sz="12"/>
                     <w:right w:val="none" w:color="FFFFFF" w:sz="0"/>
                   </w:tcBorders>
                   <w:tcMar>
@@ -1833,7 +1858,7 @@
                   <w:r>
                     <w:rPr>
                       <w:rFonts w:ascii="Arial" w:cs="Arial" w:eastAsia="Arial" w:hAnsi="Arial"/>
-                      <w:color w:val="555555"/>
+                      <w:color w:val="333333"/>
                       <w:sz w:val="17"/>
                       <w:szCs w:val="17"/>
                     </w:rPr>
@@ -1857,7 +1882,7 @@
                   <w:r>
                     <w:rPr>
                       <w:rFonts w:ascii="Arial" w:cs="Arial" w:eastAsia="Arial" w:hAnsi="Arial"/>
-                      <w:color w:val="555555"/>
+                      <w:color w:val="333333"/>
                       <w:sz w:val="17"/>
                       <w:szCs w:val="17"/>
                     </w:rPr>
@@ -1883,26 +1908,31 @@
               <w:tc>
                 <w:tcPr>
                   <w:tcW w:type="dxa" w:w="3119"/>
-                  <w:shd w:fill="2B59C3" w:color="auto" w:val="clear"/>
-                  <w:tcMar>
-                    <w:top w:type="dxa" w:w="0"/>
-                    <w:left w:type="dxa" w:w="85"/>
-                    <w:bottom w:type="dxa" w:w="0"/>
-                    <w:right w:type="dxa" w:w="85"/>
-                  </w:tcMar>
-                  <w:vAlign w:val="center"/>
-                </w:tcPr>
-                <w:p>
-                  <w:pPr>
-                    <w:spacing w:after="0" w:before="0" w:line="240"/>
-                    <w:jc w:val="center"/>
-                  </w:pPr>
-                  <w:r>
-                    <w:rPr>
-                      <w:rFonts w:ascii="Arial" w:cs="Arial" w:eastAsia="Arial" w:hAnsi="Arial"/>
-                      <w:b/>
-                      <w:bCs/>
-                      <w:color w:val="FFFFFF"/>
+                  <w:tcBorders>
+                    <w:top w:val="single" w:color="000000" w:sz="12"/>
+                    <w:left w:val="none" w:color="FFFFFF" w:sz="0"/>
+                    <w:bottom w:val="none" w:color="FFFFFF" w:sz="0"/>
+                    <w:right w:val="none" w:color="FFFFFF" w:sz="0"/>
+                  </w:tcBorders>
+                  <w:tcMar>
+                    <w:top w:type="dxa" w:w="0"/>
+                    <w:left w:type="dxa" w:w="85"/>
+                    <w:bottom w:type="dxa" w:w="0"/>
+                    <w:right w:type="dxa" w:w="85"/>
+                  </w:tcMar>
+                  <w:vAlign w:val="center"/>
+                </w:tcPr>
+                <w:p>
+                  <w:pPr>
+                    <w:spacing w:after="0" w:before="0" w:line="240"/>
+                    <w:jc w:val="center"/>
+                  </w:pPr>
+                  <w:r>
+                    <w:rPr>
+                      <w:rFonts w:ascii="Arial" w:cs="Arial" w:eastAsia="Arial" w:hAnsi="Arial"/>
+                      <w:b/>
+                      <w:bCs/>
+                      <w:color w:val="000000"/>
                       <w:sz w:val="16"/>
                       <w:szCs w:val="16"/>
                     </w:rPr>
@@ -1937,10 +1967,10 @@
           <w:tcPr>
             <w:tcW w:type="dxa" w:w="3402"/>
             <w:tcBorders>
-              <w:top w:val="dashed" w:color="9AA5B8" w:sz="4"/>
-              <w:left w:val="dashed" w:color="9AA5B8" w:sz="4"/>
-              <w:bottom w:val="dashed" w:color="9AA5B8" w:sz="4"/>
-              <w:right w:val="dashed" w:color="9AA5B8" w:sz="4"/>
+              <w:top w:val="dashed" w:color="808080" w:sz="4"/>
+              <w:left w:val="dashed" w:color="808080" w:sz="4"/>
+              <w:bottom w:val="dashed" w:color="808080" w:sz="4"/>
+              <w:right w:val="dashed" w:color="808080" w:sz="4"/>
             </w:tcBorders>
             <w:tcMar>
               <w:top w:type="dxa" w:w="170"/>
@@ -1974,7 +2004,7 @@
               <w:tc>
                 <w:tcPr>
                   <w:tcW w:type="dxa" w:w="3119"/>
-                  <w:shd w:fill="14306E" w:color="auto" w:val="clear"/>
+                  <w:shd w:fill="000000" w:color="auto" w:val="clear"/>
                   <w:tcMar>
                     <w:top w:type="dxa" w:w="0"/>
                     <w:left w:type="dxa" w:w="85"/>
@@ -2008,7 +2038,7 @@
                   <w:r>
                     <w:rPr>
                       <w:rFonts w:ascii="Arial" w:cs="Arial" w:eastAsia="Arial" w:hAnsi="Arial"/>
-                      <w:color w:val="C9D8F5"/>
+                      <w:color w:val="FFFFFF"/>
                       <w:sz w:val="14"/>
                       <w:szCs w:val="14"/>
                     </w:rPr>
@@ -2025,26 +2055,26 @@
               <w:tc>
                 <w:tcPr>
                   <w:tcW w:type="dxa" w:w="3119"/>
-                  <w:shd w:fill="E6EEFB" w:color="auto" w:val="clear"/>
-                  <w:tcMar>
-                    <w:top w:type="dxa" w:w="0"/>
-                    <w:left w:type="dxa" w:w="85"/>
-                    <w:bottom w:type="dxa" w:w="0"/>
-                    <w:right w:type="dxa" w:w="85"/>
-                  </w:tcMar>
-                  <w:vAlign w:val="center"/>
-                </w:tcPr>
-                <w:p>
-                  <w:pPr>
-                    <w:spacing w:after="0" w:before="0" w:line="240"/>
-                    <w:jc w:val="center"/>
-                  </w:pPr>
-                  <w:r>
-                    <w:rPr>
-                      <w:rFonts w:ascii="Arial" w:cs="Arial" w:eastAsia="Arial" w:hAnsi="Arial"/>
-                      <w:b/>
-                      <w:bCs/>
-                      <w:color w:val="14306E"/>
+                  <w:shd w:fill="E0E0E0" w:color="auto" w:val="clear"/>
+                  <w:tcMar>
+                    <w:top w:type="dxa" w:w="0"/>
+                    <w:left w:type="dxa" w:w="85"/>
+                    <w:bottom w:type="dxa" w:w="0"/>
+                    <w:right w:type="dxa" w:w="85"/>
+                  </w:tcMar>
+                  <w:vAlign w:val="center"/>
+                </w:tcPr>
+                <w:p>
+                  <w:pPr>
+                    <w:spacing w:after="0" w:before="0" w:line="240"/>
+                    <w:jc w:val="center"/>
+                  </w:pPr>
+                  <w:r>
+                    <w:rPr>
+                      <w:rFonts w:ascii="Arial" w:cs="Arial" w:eastAsia="Arial" w:hAnsi="Arial"/>
+                      <w:b/>
+                      <w:bCs/>
+                      <w:color w:val="000000"/>
                       <w:sz w:val="26"/>
                       <w:szCs w:val="26"/>
                     </w:rPr>
@@ -2061,7 +2091,7 @@
                       <w:rFonts w:ascii="Arial" w:cs="Arial" w:eastAsia="Arial" w:hAnsi="Arial"/>
                       <w:b/>
                       <w:bCs/>
-                      <w:color w:val="14306E"/>
+                      <w:color w:val="000000"/>
                       <w:sz w:val="26"/>
                       <w:szCs w:val="26"/>
                     </w:rPr>
@@ -2079,9 +2109,9 @@
                 <w:tcPr>
                   <w:tcW w:type="dxa" w:w="3119"/>
                   <w:tcBorders>
-                    <w:top w:val="single" w:color="2B59C3" w:sz="6"/>
+                    <w:top w:val="single" w:color="000000" w:sz="12"/>
                     <w:left w:val="none" w:color="FFFFFF" w:sz="0"/>
-                    <w:bottom w:val="single" w:color="2B59C3" w:sz="6"/>
+                    <w:bottom w:val="single" w:color="000000" w:sz="12"/>
                     <w:right w:val="none" w:color="FFFFFF" w:sz="0"/>
                   </w:tcBorders>
                   <w:tcMar>
@@ -2152,7 +2182,7 @@
                   <w:r>
                     <w:rPr>
                       <w:rFonts w:ascii="Arial" w:cs="Arial" w:eastAsia="Arial" w:hAnsi="Arial"/>
-                      <w:color w:val="555555"/>
+                      <w:color w:val="333333"/>
                       <w:sz w:val="17"/>
                       <w:szCs w:val="17"/>
                     </w:rPr>
@@ -2176,7 +2206,7 @@
                   <w:r>
                     <w:rPr>
                       <w:rFonts w:ascii="Arial" w:cs="Arial" w:eastAsia="Arial" w:hAnsi="Arial"/>
-                      <w:color w:val="555555"/>
+                      <w:color w:val="333333"/>
                       <w:sz w:val="17"/>
                       <w:szCs w:val="17"/>
                     </w:rPr>
@@ -2202,26 +2232,31 @@
               <w:tc>
                 <w:tcPr>
                   <w:tcW w:type="dxa" w:w="3119"/>
-                  <w:shd w:fill="2B59C3" w:color="auto" w:val="clear"/>
-                  <w:tcMar>
-                    <w:top w:type="dxa" w:w="0"/>
-                    <w:left w:type="dxa" w:w="85"/>
-                    <w:bottom w:type="dxa" w:w="0"/>
-                    <w:right w:type="dxa" w:w="85"/>
-                  </w:tcMar>
-                  <w:vAlign w:val="center"/>
-                </w:tcPr>
-                <w:p>
-                  <w:pPr>
-                    <w:spacing w:after="0" w:before="0" w:line="240"/>
-                    <w:jc w:val="center"/>
-                  </w:pPr>
-                  <w:r>
-                    <w:rPr>
-                      <w:rFonts w:ascii="Arial" w:cs="Arial" w:eastAsia="Arial" w:hAnsi="Arial"/>
-                      <w:b/>
-                      <w:bCs/>
-                      <w:color w:val="FFFFFF"/>
+                  <w:tcBorders>
+                    <w:top w:val="single" w:color="000000" w:sz="12"/>
+                    <w:left w:val="none" w:color="FFFFFF" w:sz="0"/>
+                    <w:bottom w:val="none" w:color="FFFFFF" w:sz="0"/>
+                    <w:right w:val="none" w:color="FFFFFF" w:sz="0"/>
+                  </w:tcBorders>
+                  <w:tcMar>
+                    <w:top w:type="dxa" w:w="0"/>
+                    <w:left w:type="dxa" w:w="85"/>
+                    <w:bottom w:type="dxa" w:w="0"/>
+                    <w:right w:type="dxa" w:w="85"/>
+                  </w:tcMar>
+                  <w:vAlign w:val="center"/>
+                </w:tcPr>
+                <w:p>
+                  <w:pPr>
+                    <w:spacing w:after="0" w:before="0" w:line="240"/>
+                    <w:jc w:val="center"/>
+                  </w:pPr>
+                  <w:r>
+                    <w:rPr>
+                      <w:rFonts w:ascii="Arial" w:cs="Arial" w:eastAsia="Arial" w:hAnsi="Arial"/>
+                      <w:b/>
+                      <w:bCs/>
+                      <w:color w:val="000000"/>
                       <w:sz w:val="16"/>
                       <w:szCs w:val="16"/>
                     </w:rPr>
@@ -2250,10 +2285,10 @@
           <w:tcPr>
             <w:tcW w:type="dxa" w:w="3402"/>
             <w:tcBorders>
-              <w:top w:val="dashed" w:color="9AA5B8" w:sz="4"/>
-              <w:left w:val="dashed" w:color="9AA5B8" w:sz="4"/>
-              <w:bottom w:val="dashed" w:color="9AA5B8" w:sz="4"/>
-              <w:right w:val="dashed" w:color="9AA5B8" w:sz="4"/>
+              <w:top w:val="dashed" w:color="808080" w:sz="4"/>
+              <w:left w:val="dashed" w:color="808080" w:sz="4"/>
+              <w:bottom w:val="dashed" w:color="808080" w:sz="4"/>
+              <w:right w:val="dashed" w:color="808080" w:sz="4"/>
             </w:tcBorders>
             <w:tcMar>
               <w:top w:type="dxa" w:w="170"/>
@@ -2287,7 +2322,7 @@
               <w:tc>
                 <w:tcPr>
                   <w:tcW w:type="dxa" w:w="3119"/>
-                  <w:shd w:fill="14306E" w:color="auto" w:val="clear"/>
+                  <w:shd w:fill="000000" w:color="auto" w:val="clear"/>
                   <w:tcMar>
                     <w:top w:type="dxa" w:w="0"/>
                     <w:left w:type="dxa" w:w="85"/>
@@ -2321,7 +2356,7 @@
                   <w:r>
                     <w:rPr>
                       <w:rFonts w:ascii="Arial" w:cs="Arial" w:eastAsia="Arial" w:hAnsi="Arial"/>
-                      <w:color w:val="C9D8F5"/>
+                      <w:color w:val="FFFFFF"/>
                       <w:sz w:val="14"/>
                       <w:szCs w:val="14"/>
                     </w:rPr>
@@ -2338,26 +2373,26 @@
               <w:tc>
                 <w:tcPr>
                   <w:tcW w:type="dxa" w:w="3119"/>
-                  <w:shd w:fill="E6EEFB" w:color="auto" w:val="clear"/>
-                  <w:tcMar>
-                    <w:top w:type="dxa" w:w="0"/>
-                    <w:left w:type="dxa" w:w="85"/>
-                    <w:bottom w:type="dxa" w:w="0"/>
-                    <w:right w:type="dxa" w:w="85"/>
-                  </w:tcMar>
-                  <w:vAlign w:val="center"/>
-                </w:tcPr>
-                <w:p>
-                  <w:pPr>
-                    <w:spacing w:after="0" w:before="0" w:line="240"/>
-                    <w:jc w:val="center"/>
-                  </w:pPr>
-                  <w:r>
-                    <w:rPr>
-                      <w:rFonts w:ascii="Arial" w:cs="Arial" w:eastAsia="Arial" w:hAnsi="Arial"/>
-                      <w:b/>
-                      <w:bCs/>
-                      <w:color w:val="14306E"/>
+                  <w:shd w:fill="E0E0E0" w:color="auto" w:val="clear"/>
+                  <w:tcMar>
+                    <w:top w:type="dxa" w:w="0"/>
+                    <w:left w:type="dxa" w:w="85"/>
+                    <w:bottom w:type="dxa" w:w="0"/>
+                    <w:right w:type="dxa" w:w="85"/>
+                  </w:tcMar>
+                  <w:vAlign w:val="center"/>
+                </w:tcPr>
+                <w:p>
+                  <w:pPr>
+                    <w:spacing w:after="0" w:before="0" w:line="240"/>
+                    <w:jc w:val="center"/>
+                  </w:pPr>
+                  <w:r>
+                    <w:rPr>
+                      <w:rFonts w:ascii="Arial" w:cs="Arial" w:eastAsia="Arial" w:hAnsi="Arial"/>
+                      <w:b/>
+                      <w:bCs/>
+                      <w:color w:val="000000"/>
                       <w:sz w:val="26"/>
                       <w:szCs w:val="26"/>
                     </w:rPr>
@@ -2374,7 +2409,7 @@
                       <w:rFonts w:ascii="Arial" w:cs="Arial" w:eastAsia="Arial" w:hAnsi="Arial"/>
                       <w:b/>
                       <w:bCs/>
-                      <w:color w:val="14306E"/>
+                      <w:color w:val="000000"/>
                       <w:sz w:val="26"/>
                       <w:szCs w:val="26"/>
                     </w:rPr>
@@ -2392,9 +2427,9 @@
                 <w:tcPr>
                   <w:tcW w:type="dxa" w:w="3119"/>
                   <w:tcBorders>
-                    <w:top w:val="single" w:color="2B59C3" w:sz="6"/>
+                    <w:top w:val="single" w:color="000000" w:sz="12"/>
                     <w:left w:val="none" w:color="FFFFFF" w:sz="0"/>
-                    <w:bottom w:val="single" w:color="2B59C3" w:sz="6"/>
+                    <w:bottom w:val="single" w:color="000000" w:sz="12"/>
                     <w:right w:val="none" w:color="FFFFFF" w:sz="0"/>
                   </w:tcBorders>
                   <w:tcMar>
@@ -2465,7 +2500,7 @@
                   <w:r>
                     <w:rPr>
                       <w:rFonts w:ascii="Arial" w:cs="Arial" w:eastAsia="Arial" w:hAnsi="Arial"/>
-                      <w:color w:val="555555"/>
+                      <w:color w:val="333333"/>
                       <w:sz w:val="17"/>
                       <w:szCs w:val="17"/>
                     </w:rPr>
@@ -2489,7 +2524,7 @@
                   <w:r>
                     <w:rPr>
                       <w:rFonts w:ascii="Arial" w:cs="Arial" w:eastAsia="Arial" w:hAnsi="Arial"/>
-                      <w:color w:val="555555"/>
+                      <w:color w:val="333333"/>
                       <w:sz w:val="17"/>
                       <w:szCs w:val="17"/>
                     </w:rPr>
@@ -2515,26 +2550,31 @@
               <w:tc>
                 <w:tcPr>
                   <w:tcW w:type="dxa" w:w="3119"/>
-                  <w:shd w:fill="2B59C3" w:color="auto" w:val="clear"/>
-                  <w:tcMar>
-                    <w:top w:type="dxa" w:w="0"/>
-                    <w:left w:type="dxa" w:w="85"/>
-                    <w:bottom w:type="dxa" w:w="0"/>
-                    <w:right w:type="dxa" w:w="85"/>
-                  </w:tcMar>
-                  <w:vAlign w:val="center"/>
-                </w:tcPr>
-                <w:p>
-                  <w:pPr>
-                    <w:spacing w:after="0" w:before="0" w:line="240"/>
-                    <w:jc w:val="center"/>
-                  </w:pPr>
-                  <w:r>
-                    <w:rPr>
-                      <w:rFonts w:ascii="Arial" w:cs="Arial" w:eastAsia="Arial" w:hAnsi="Arial"/>
-                      <w:b/>
-                      <w:bCs/>
-                      <w:color w:val="FFFFFF"/>
+                  <w:tcBorders>
+                    <w:top w:val="single" w:color="000000" w:sz="12"/>
+                    <w:left w:val="none" w:color="FFFFFF" w:sz="0"/>
+                    <w:bottom w:val="none" w:color="FFFFFF" w:sz="0"/>
+                    <w:right w:val="none" w:color="FFFFFF" w:sz="0"/>
+                  </w:tcBorders>
+                  <w:tcMar>
+                    <w:top w:type="dxa" w:w="0"/>
+                    <w:left w:type="dxa" w:w="85"/>
+                    <w:bottom w:type="dxa" w:w="0"/>
+                    <w:right w:type="dxa" w:w="85"/>
+                  </w:tcMar>
+                  <w:vAlign w:val="center"/>
+                </w:tcPr>
+                <w:p>
+                  <w:pPr>
+                    <w:spacing w:after="0" w:before="0" w:line="240"/>
+                    <w:jc w:val="center"/>
+                  </w:pPr>
+                  <w:r>
+                    <w:rPr>
+                      <w:rFonts w:ascii="Arial" w:cs="Arial" w:eastAsia="Arial" w:hAnsi="Arial"/>
+                      <w:b/>
+                      <w:bCs/>
+                      <w:color w:val="000000"/>
                       <w:sz w:val="16"/>
                       <w:szCs w:val="16"/>
                     </w:rPr>
@@ -2563,10 +2603,10 @@
           <w:tcPr>
             <w:tcW w:type="dxa" w:w="3402"/>
             <w:tcBorders>
-              <w:top w:val="dashed" w:color="9AA5B8" w:sz="4"/>
-              <w:left w:val="dashed" w:color="9AA5B8" w:sz="4"/>
-              <w:bottom w:val="dashed" w:color="9AA5B8" w:sz="4"/>
-              <w:right w:val="dashed" w:color="9AA5B8" w:sz="4"/>
+              <w:top w:val="dashed" w:color="808080" w:sz="4"/>
+              <w:left w:val="dashed" w:color="808080" w:sz="4"/>
+              <w:bottom w:val="dashed" w:color="808080" w:sz="4"/>
+              <w:right w:val="dashed" w:color="808080" w:sz="4"/>
             </w:tcBorders>
             <w:tcMar>
               <w:top w:type="dxa" w:w="170"/>
@@ -2600,7 +2640,7 @@
               <w:tc>
                 <w:tcPr>
                   <w:tcW w:type="dxa" w:w="3119"/>
-                  <w:shd w:fill="14306E" w:color="auto" w:val="clear"/>
+                  <w:shd w:fill="000000" w:color="auto" w:val="clear"/>
                   <w:tcMar>
                     <w:top w:type="dxa" w:w="0"/>
                     <w:left w:type="dxa" w:w="85"/>
@@ -2634,7 +2674,7 @@
                   <w:r>
                     <w:rPr>
                       <w:rFonts w:ascii="Arial" w:cs="Arial" w:eastAsia="Arial" w:hAnsi="Arial"/>
-                      <w:color w:val="C9D8F5"/>
+                      <w:color w:val="FFFFFF"/>
                       <w:sz w:val="14"/>
                       <w:szCs w:val="14"/>
                     </w:rPr>
@@ -2651,26 +2691,26 @@
               <w:tc>
                 <w:tcPr>
                   <w:tcW w:type="dxa" w:w="3119"/>
-                  <w:shd w:fill="E6EEFB" w:color="auto" w:val="clear"/>
-                  <w:tcMar>
-                    <w:top w:type="dxa" w:w="0"/>
-                    <w:left w:type="dxa" w:w="85"/>
-                    <w:bottom w:type="dxa" w:w="0"/>
-                    <w:right w:type="dxa" w:w="85"/>
-                  </w:tcMar>
-                  <w:vAlign w:val="center"/>
-                </w:tcPr>
-                <w:p>
-                  <w:pPr>
-                    <w:spacing w:after="0" w:before="0" w:line="240"/>
-                    <w:jc w:val="center"/>
-                  </w:pPr>
-                  <w:r>
-                    <w:rPr>
-                      <w:rFonts w:ascii="Arial" w:cs="Arial" w:eastAsia="Arial" w:hAnsi="Arial"/>
-                      <w:b/>
-                      <w:bCs/>
-                      <w:color w:val="14306E"/>
+                  <w:shd w:fill="E0E0E0" w:color="auto" w:val="clear"/>
+                  <w:tcMar>
+                    <w:top w:type="dxa" w:w="0"/>
+                    <w:left w:type="dxa" w:w="85"/>
+                    <w:bottom w:type="dxa" w:w="0"/>
+                    <w:right w:type="dxa" w:w="85"/>
+                  </w:tcMar>
+                  <w:vAlign w:val="center"/>
+                </w:tcPr>
+                <w:p>
+                  <w:pPr>
+                    <w:spacing w:after="0" w:before="0" w:line="240"/>
+                    <w:jc w:val="center"/>
+                  </w:pPr>
+                  <w:r>
+                    <w:rPr>
+                      <w:rFonts w:ascii="Arial" w:cs="Arial" w:eastAsia="Arial" w:hAnsi="Arial"/>
+                      <w:b/>
+                      <w:bCs/>
+                      <w:color w:val="000000"/>
                       <w:sz w:val="26"/>
                       <w:szCs w:val="26"/>
                     </w:rPr>
@@ -2687,7 +2727,7 @@
                       <w:rFonts w:ascii="Arial" w:cs="Arial" w:eastAsia="Arial" w:hAnsi="Arial"/>
                       <w:b/>
                       <w:bCs/>
-                      <w:color w:val="14306E"/>
+                      <w:color w:val="000000"/>
                       <w:sz w:val="26"/>
                       <w:szCs w:val="26"/>
                     </w:rPr>
@@ -2705,9 +2745,9 @@
                 <w:tcPr>
                   <w:tcW w:type="dxa" w:w="3119"/>
                   <w:tcBorders>
-                    <w:top w:val="single" w:color="2B59C3" w:sz="6"/>
+                    <w:top w:val="single" w:color="000000" w:sz="12"/>
                     <w:left w:val="none" w:color="FFFFFF" w:sz="0"/>
-                    <w:bottom w:val="single" w:color="2B59C3" w:sz="6"/>
+                    <w:bottom w:val="single" w:color="000000" w:sz="12"/>
                     <w:right w:val="none" w:color="FFFFFF" w:sz="0"/>
                   </w:tcBorders>
                   <w:tcMar>
@@ -2778,7 +2818,7 @@
                   <w:r>
                     <w:rPr>
                       <w:rFonts w:ascii="Arial" w:cs="Arial" w:eastAsia="Arial" w:hAnsi="Arial"/>
-                      <w:color w:val="555555"/>
+                      <w:color w:val="333333"/>
                       <w:sz w:val="17"/>
                       <w:szCs w:val="17"/>
                     </w:rPr>
@@ -2802,7 +2842,7 @@
                   <w:r>
                     <w:rPr>
                       <w:rFonts w:ascii="Arial" w:cs="Arial" w:eastAsia="Arial" w:hAnsi="Arial"/>
-                      <w:color w:val="555555"/>
+                      <w:color w:val="333333"/>
                       <w:sz w:val="17"/>
                       <w:szCs w:val="17"/>
                     </w:rPr>
@@ -2828,26 +2868,31 @@
               <w:tc>
                 <w:tcPr>
                   <w:tcW w:type="dxa" w:w="3119"/>
-                  <w:shd w:fill="2B59C3" w:color="auto" w:val="clear"/>
-                  <w:tcMar>
-                    <w:top w:type="dxa" w:w="0"/>
-                    <w:left w:type="dxa" w:w="85"/>
-                    <w:bottom w:type="dxa" w:w="0"/>
-                    <w:right w:type="dxa" w:w="85"/>
-                  </w:tcMar>
-                  <w:vAlign w:val="center"/>
-                </w:tcPr>
-                <w:p>
-                  <w:pPr>
-                    <w:spacing w:after="0" w:before="0" w:line="240"/>
-                    <w:jc w:val="center"/>
-                  </w:pPr>
-                  <w:r>
-                    <w:rPr>
-                      <w:rFonts w:ascii="Arial" w:cs="Arial" w:eastAsia="Arial" w:hAnsi="Arial"/>
-                      <w:b/>
-                      <w:bCs/>
-                      <w:color w:val="FFFFFF"/>
+                  <w:tcBorders>
+                    <w:top w:val="single" w:color="000000" w:sz="12"/>
+                    <w:left w:val="none" w:color="FFFFFF" w:sz="0"/>
+                    <w:bottom w:val="none" w:color="FFFFFF" w:sz="0"/>
+                    <w:right w:val="none" w:color="FFFFFF" w:sz="0"/>
+                  </w:tcBorders>
+                  <w:tcMar>
+                    <w:top w:type="dxa" w:w="0"/>
+                    <w:left w:type="dxa" w:w="85"/>
+                    <w:bottom w:type="dxa" w:w="0"/>
+                    <w:right w:type="dxa" w:w="85"/>
+                  </w:tcMar>
+                  <w:vAlign w:val="center"/>
+                </w:tcPr>
+                <w:p>
+                  <w:pPr>
+                    <w:spacing w:after="0" w:before="0" w:line="240"/>
+                    <w:jc w:val="center"/>
+                  </w:pPr>
+                  <w:r>
+                    <w:rPr>
+                      <w:rFonts w:ascii="Arial" w:cs="Arial" w:eastAsia="Arial" w:hAnsi="Arial"/>
+                      <w:b/>
+                      <w:bCs/>
+                      <w:color w:val="000000"/>
                       <w:sz w:val="16"/>
                       <w:szCs w:val="16"/>
                     </w:rPr>

</xml_diff>

<commit_message>
Fill badge with participant details
Co-Authored-By: Claude Opus 5.5 <noreply@anthropic.com>
Claude-Session: https://claude.ai/code/session_0149sWXEwDW8TGDudhT4YAQy
</commit_message>
<xml_diff>
--- a/badge/badge_zamestitel_uchitelya.docx
+++ b/badge/badge_zamestitel_uchitelya.docx
@@ -16,7 +16,7 @@
           <w:sz w:val="15"/>
           <w:szCs w:val="15"/>
         </w:rPr>
-        <w:t xml:space="preserve">Вкладыш 6,0 × 7,4 см, видимая область 5,5 × 6,8 см. Печать в масштабе 100 %, вырезать по пунктиру. Замените «Фамилия», «Имя», предмет, класс и номер школы.</w:t>
+        <w:t xml:space="preserve">Вкладыш 6,0 × 7,4 см, видимая область 5,5 × 6,8 см. Печать в масштабе 100 %, вырезать по пунктиру. </w:t>
       </w:r>
     </w:p>
     <w:tbl>
@@ -122,7 +122,7 @@
                       <w:sz w:val="14"/>
                       <w:szCs w:val="14"/>
                     </w:rPr>
-                    <w:t xml:space="preserve">МБОУ «СОШ № ___»</w:t>
+                    <w:t xml:space="preserve">Школа № 12</w:t>
                   </w:r>
                 </w:p>
               </w:tc>
@@ -216,7 +216,7 @@
                       <w:sz w:val="26"/>
                       <w:szCs w:val="26"/>
                     </w:rPr>
-                    <w:t xml:space="preserve">Фамилия</w:t>
+                    <w:t xml:space="preserve">Досбаев</w:t>
                   </w:r>
                 </w:p>
                 <w:p>
@@ -233,7 +233,7 @@
                       <w:sz w:val="26"/>
                       <w:szCs w:val="26"/>
                     </w:rPr>
-                    <w:t xml:space="preserve">Имя</w:t>
+                    <w:t xml:space="preserve">Константин</w:t>
                   </w:r>
                 </w:p>
               </w:tc>
@@ -271,11 +271,13 @@
                   <w:r>
                     <w:rPr>
                       <w:rFonts w:ascii="Arial" w:cs="Arial" w:eastAsia="Arial" w:hAnsi="Arial"/>
+                      <w:b/>
+                      <w:bCs/>
                       <w:color w:val="111111"/>
                       <w:sz w:val="17"/>
                       <w:szCs w:val="17"/>
                     </w:rPr>
-                    <w:t xml:space="preserve">_____________</w:t>
+                    <w:t xml:space="preserve">музыка</w:t>
                   </w:r>
                 </w:p>
                 <w:p>
@@ -295,11 +297,13 @@
                   <w:r>
                     <w:rPr>
                       <w:rFonts w:ascii="Arial" w:cs="Arial" w:eastAsia="Arial" w:hAnsi="Arial"/>
+                      <w:b/>
+                      <w:bCs/>
                       <w:color w:val="111111"/>
                       <w:sz w:val="17"/>
                       <w:szCs w:val="17"/>
                     </w:rPr>
-                    <w:t xml:space="preserve">_______</w:t>
+                    <w:t xml:space="preserve">11 «Б»</w:t>
                   </w:r>
                 </w:p>
               </w:tc>
@@ -440,7 +444,7 @@
                       <w:sz w:val="14"/>
                       <w:szCs w:val="14"/>
                     </w:rPr>
-                    <w:t xml:space="preserve">МБОУ «СОШ № ___»</w:t>
+                    <w:t xml:space="preserve">Школа № 12</w:t>
                   </w:r>
                 </w:p>
               </w:tc>
@@ -534,7 +538,7 @@
                       <w:sz w:val="26"/>
                       <w:szCs w:val="26"/>
                     </w:rPr>
-                    <w:t xml:space="preserve">Фамилия</w:t>
+                    <w:t xml:space="preserve">Досбаев</w:t>
                   </w:r>
                 </w:p>
                 <w:p>
@@ -551,7 +555,7 @@
                       <w:sz w:val="26"/>
                       <w:szCs w:val="26"/>
                     </w:rPr>
-                    <w:t xml:space="preserve">Имя</w:t>
+                    <w:t xml:space="preserve">Константин</w:t>
                   </w:r>
                 </w:p>
               </w:tc>
@@ -589,11 +593,13 @@
                   <w:r>
                     <w:rPr>
                       <w:rFonts w:ascii="Arial" w:cs="Arial" w:eastAsia="Arial" w:hAnsi="Arial"/>
+                      <w:b/>
+                      <w:bCs/>
                       <w:color w:val="111111"/>
                       <w:sz w:val="17"/>
                       <w:szCs w:val="17"/>
                     </w:rPr>
-                    <w:t xml:space="preserve">_____________</w:t>
+                    <w:t xml:space="preserve">музыка</w:t>
                   </w:r>
                 </w:p>
                 <w:p>
@@ -613,11 +619,13 @@
                   <w:r>
                     <w:rPr>
                       <w:rFonts w:ascii="Arial" w:cs="Arial" w:eastAsia="Arial" w:hAnsi="Arial"/>
+                      <w:b/>
+                      <w:bCs/>
                       <w:color w:val="111111"/>
                       <w:sz w:val="17"/>
                       <w:szCs w:val="17"/>
                     </w:rPr>
-                    <w:t xml:space="preserve">_______</w:t>
+                    <w:t xml:space="preserve">11 «Б»</w:t>
                   </w:r>
                 </w:p>
               </w:tc>
@@ -758,7 +766,7 @@
                       <w:sz w:val="14"/>
                       <w:szCs w:val="14"/>
                     </w:rPr>
-                    <w:t xml:space="preserve">МБОУ «СОШ № ___»</w:t>
+                    <w:t xml:space="preserve">Школа № 12</w:t>
                   </w:r>
                 </w:p>
               </w:tc>
@@ -852,7 +860,7 @@
                       <w:sz w:val="26"/>
                       <w:szCs w:val="26"/>
                     </w:rPr>
-                    <w:t xml:space="preserve">Фамилия</w:t>
+                    <w:t xml:space="preserve">Досбаев</w:t>
                   </w:r>
                 </w:p>
                 <w:p>
@@ -869,7 +877,7 @@
                       <w:sz w:val="26"/>
                       <w:szCs w:val="26"/>
                     </w:rPr>
-                    <w:t xml:space="preserve">Имя</w:t>
+                    <w:t xml:space="preserve">Константин</w:t>
                   </w:r>
                 </w:p>
               </w:tc>
@@ -907,11 +915,13 @@
                   <w:r>
                     <w:rPr>
                       <w:rFonts w:ascii="Arial" w:cs="Arial" w:eastAsia="Arial" w:hAnsi="Arial"/>
+                      <w:b/>
+                      <w:bCs/>
                       <w:color w:val="111111"/>
                       <w:sz w:val="17"/>
                       <w:szCs w:val="17"/>
                     </w:rPr>
-                    <w:t xml:space="preserve">_____________</w:t>
+                    <w:t xml:space="preserve">музыка</w:t>
                   </w:r>
                 </w:p>
                 <w:p>
@@ -931,11 +941,13 @@
                   <w:r>
                     <w:rPr>
                       <w:rFonts w:ascii="Arial" w:cs="Arial" w:eastAsia="Arial" w:hAnsi="Arial"/>
+                      <w:b/>
+                      <w:bCs/>
                       <w:color w:val="111111"/>
                       <w:sz w:val="17"/>
                       <w:szCs w:val="17"/>
                     </w:rPr>
-                    <w:t xml:space="preserve">_______</w:t>
+                    <w:t xml:space="preserve">11 «Б»</w:t>
                   </w:r>
                 </w:p>
               </w:tc>
@@ -1082,7 +1094,7 @@
                       <w:sz w:val="14"/>
                       <w:szCs w:val="14"/>
                     </w:rPr>
-                    <w:t xml:space="preserve">МБОУ «СОШ № ___»</w:t>
+                    <w:t xml:space="preserve">Школа № 12</w:t>
                   </w:r>
                 </w:p>
               </w:tc>
@@ -1176,7 +1188,7 @@
                       <w:sz w:val="26"/>
                       <w:szCs w:val="26"/>
                     </w:rPr>
-                    <w:t xml:space="preserve">Фамилия</w:t>
+                    <w:t xml:space="preserve">Досбаев</w:t>
                   </w:r>
                 </w:p>
                 <w:p>
@@ -1193,7 +1205,7 @@
                       <w:sz w:val="26"/>
                       <w:szCs w:val="26"/>
                     </w:rPr>
-                    <w:t xml:space="preserve">Имя</w:t>
+                    <w:t xml:space="preserve">Константин</w:t>
                   </w:r>
                 </w:p>
               </w:tc>
@@ -1231,11 +1243,13 @@
                   <w:r>
                     <w:rPr>
                       <w:rFonts w:ascii="Arial" w:cs="Arial" w:eastAsia="Arial" w:hAnsi="Arial"/>
+                      <w:b/>
+                      <w:bCs/>
                       <w:color w:val="111111"/>
                       <w:sz w:val="17"/>
                       <w:szCs w:val="17"/>
                     </w:rPr>
-                    <w:t xml:space="preserve">_____________</w:t>
+                    <w:t xml:space="preserve">музыка</w:t>
                   </w:r>
                 </w:p>
                 <w:p>
@@ -1255,11 +1269,13 @@
                   <w:r>
                     <w:rPr>
                       <w:rFonts w:ascii="Arial" w:cs="Arial" w:eastAsia="Arial" w:hAnsi="Arial"/>
+                      <w:b/>
+                      <w:bCs/>
                       <w:color w:val="111111"/>
                       <w:sz w:val="17"/>
                       <w:szCs w:val="17"/>
                     </w:rPr>
-                    <w:t xml:space="preserve">_______</w:t>
+                    <w:t xml:space="preserve">11 «Б»</w:t>
                   </w:r>
                 </w:p>
               </w:tc>
@@ -1400,7 +1416,7 @@
                       <w:sz w:val="14"/>
                       <w:szCs w:val="14"/>
                     </w:rPr>
-                    <w:t xml:space="preserve">МБОУ «СОШ № ___»</w:t>
+                    <w:t xml:space="preserve">Школа № 12</w:t>
                   </w:r>
                 </w:p>
               </w:tc>
@@ -1494,7 +1510,7 @@
                       <w:sz w:val="26"/>
                       <w:szCs w:val="26"/>
                     </w:rPr>
-                    <w:t xml:space="preserve">Фамилия</w:t>
+                    <w:t xml:space="preserve">Досбаев</w:t>
                   </w:r>
                 </w:p>
                 <w:p>
@@ -1511,7 +1527,7 @@
                       <w:sz w:val="26"/>
                       <w:szCs w:val="26"/>
                     </w:rPr>
-                    <w:t xml:space="preserve">Имя</w:t>
+                    <w:t xml:space="preserve">Константин</w:t>
                   </w:r>
                 </w:p>
               </w:tc>
@@ -1549,11 +1565,13 @@
                   <w:r>
                     <w:rPr>
                       <w:rFonts w:ascii="Arial" w:cs="Arial" w:eastAsia="Arial" w:hAnsi="Arial"/>
+                      <w:b/>
+                      <w:bCs/>
                       <w:color w:val="111111"/>
                       <w:sz w:val="17"/>
                       <w:szCs w:val="17"/>
                     </w:rPr>
-                    <w:t xml:space="preserve">_____________</w:t>
+                    <w:t xml:space="preserve">музыка</w:t>
                   </w:r>
                 </w:p>
                 <w:p>
@@ -1573,11 +1591,13 @@
                   <w:r>
                     <w:rPr>
                       <w:rFonts w:ascii="Arial" w:cs="Arial" w:eastAsia="Arial" w:hAnsi="Arial"/>
+                      <w:b/>
+                      <w:bCs/>
                       <w:color w:val="111111"/>
                       <w:sz w:val="17"/>
                       <w:szCs w:val="17"/>
                     </w:rPr>
-                    <w:t xml:space="preserve">_______</w:t>
+                    <w:t xml:space="preserve">11 «Б»</w:t>
                   </w:r>
                 </w:p>
               </w:tc>
@@ -1718,7 +1738,7 @@
                       <w:sz w:val="14"/>
                       <w:szCs w:val="14"/>
                     </w:rPr>
-                    <w:t xml:space="preserve">МБОУ «СОШ № ___»</w:t>
+                    <w:t xml:space="preserve">Школа № 12</w:t>
                   </w:r>
                 </w:p>
               </w:tc>
@@ -1812,7 +1832,7 @@
                       <w:sz w:val="26"/>
                       <w:szCs w:val="26"/>
                     </w:rPr>
-                    <w:t xml:space="preserve">Фамилия</w:t>
+                    <w:t xml:space="preserve">Досбаев</w:t>
                   </w:r>
                 </w:p>
                 <w:p>
@@ -1829,7 +1849,7 @@
                       <w:sz w:val="26"/>
                       <w:szCs w:val="26"/>
                     </w:rPr>
-                    <w:t xml:space="preserve">Имя</w:t>
+                    <w:t xml:space="preserve">Константин</w:t>
                   </w:r>
                 </w:p>
               </w:tc>
@@ -1867,11 +1887,13 @@
                   <w:r>
                     <w:rPr>
                       <w:rFonts w:ascii="Arial" w:cs="Arial" w:eastAsia="Arial" w:hAnsi="Arial"/>
+                      <w:b/>
+                      <w:bCs/>
                       <w:color w:val="111111"/>
                       <w:sz w:val="17"/>
                       <w:szCs w:val="17"/>
                     </w:rPr>
-                    <w:t xml:space="preserve">_____________</w:t>
+                    <w:t xml:space="preserve">музыка</w:t>
                   </w:r>
                 </w:p>
                 <w:p>
@@ -1891,11 +1913,13 @@
                   <w:r>
                     <w:rPr>
                       <w:rFonts w:ascii="Arial" w:cs="Arial" w:eastAsia="Arial" w:hAnsi="Arial"/>
+                      <w:b/>
+                      <w:bCs/>
                       <w:color w:val="111111"/>
                       <w:sz w:val="17"/>
                       <w:szCs w:val="17"/>
                     </w:rPr>
-                    <w:t xml:space="preserve">_______</w:t>
+                    <w:t xml:space="preserve">11 «Б»</w:t>
                   </w:r>
                 </w:p>
               </w:tc>
@@ -2042,7 +2066,7 @@
                       <w:sz w:val="14"/>
                       <w:szCs w:val="14"/>
                     </w:rPr>
-                    <w:t xml:space="preserve">МБОУ «СОШ № ___»</w:t>
+                    <w:t xml:space="preserve">Школа № 12</w:t>
                   </w:r>
                 </w:p>
               </w:tc>
@@ -2136,7 +2160,7 @@
                       <w:sz w:val="26"/>
                       <w:szCs w:val="26"/>
                     </w:rPr>
-                    <w:t xml:space="preserve">Фамилия</w:t>
+                    <w:t xml:space="preserve">Досбаев</w:t>
                   </w:r>
                 </w:p>
                 <w:p>
@@ -2153,7 +2177,7 @@
                       <w:sz w:val="26"/>
                       <w:szCs w:val="26"/>
                     </w:rPr>
-                    <w:t xml:space="preserve">Имя</w:t>
+                    <w:t xml:space="preserve">Константин</w:t>
                   </w:r>
                 </w:p>
               </w:tc>
@@ -2191,11 +2215,13 @@
                   <w:r>
                     <w:rPr>
                       <w:rFonts w:ascii="Arial" w:cs="Arial" w:eastAsia="Arial" w:hAnsi="Arial"/>
+                      <w:b/>
+                      <w:bCs/>
                       <w:color w:val="111111"/>
                       <w:sz w:val="17"/>
                       <w:szCs w:val="17"/>
                     </w:rPr>
-                    <w:t xml:space="preserve">_____________</w:t>
+                    <w:t xml:space="preserve">музыка</w:t>
                   </w:r>
                 </w:p>
                 <w:p>
@@ -2215,11 +2241,13 @@
                   <w:r>
                     <w:rPr>
                       <w:rFonts w:ascii="Arial" w:cs="Arial" w:eastAsia="Arial" w:hAnsi="Arial"/>
+                      <w:b/>
+                      <w:bCs/>
                       <w:color w:val="111111"/>
                       <w:sz w:val="17"/>
                       <w:szCs w:val="17"/>
                     </w:rPr>
-                    <w:t xml:space="preserve">_______</w:t>
+                    <w:t xml:space="preserve">11 «Б»</w:t>
                   </w:r>
                 </w:p>
               </w:tc>
@@ -2360,7 +2388,7 @@
                       <w:sz w:val="14"/>
                       <w:szCs w:val="14"/>
                     </w:rPr>
-                    <w:t xml:space="preserve">МБОУ «СОШ № ___»</w:t>
+                    <w:t xml:space="preserve">Школа № 12</w:t>
                   </w:r>
                 </w:p>
               </w:tc>
@@ -2454,7 +2482,7 @@
                       <w:sz w:val="26"/>
                       <w:szCs w:val="26"/>
                     </w:rPr>
-                    <w:t xml:space="preserve">Фамилия</w:t>
+                    <w:t xml:space="preserve">Досбаев</w:t>
                   </w:r>
                 </w:p>
                 <w:p>
@@ -2471,7 +2499,7 @@
                       <w:sz w:val="26"/>
                       <w:szCs w:val="26"/>
                     </w:rPr>
-                    <w:t xml:space="preserve">Имя</w:t>
+                    <w:t xml:space="preserve">Константин</w:t>
                   </w:r>
                 </w:p>
               </w:tc>
@@ -2509,11 +2537,13 @@
                   <w:r>
                     <w:rPr>
                       <w:rFonts w:ascii="Arial" w:cs="Arial" w:eastAsia="Arial" w:hAnsi="Arial"/>
+                      <w:b/>
+                      <w:bCs/>
                       <w:color w:val="111111"/>
                       <w:sz w:val="17"/>
                       <w:szCs w:val="17"/>
                     </w:rPr>
-                    <w:t xml:space="preserve">_____________</w:t>
+                    <w:t xml:space="preserve">музыка</w:t>
                   </w:r>
                 </w:p>
                 <w:p>
@@ -2533,11 +2563,13 @@
                   <w:r>
                     <w:rPr>
                       <w:rFonts w:ascii="Arial" w:cs="Arial" w:eastAsia="Arial" w:hAnsi="Arial"/>
+                      <w:b/>
+                      <w:bCs/>
                       <w:color w:val="111111"/>
                       <w:sz w:val="17"/>
                       <w:szCs w:val="17"/>
                     </w:rPr>
-                    <w:t xml:space="preserve">_______</w:t>
+                    <w:t xml:space="preserve">11 «Б»</w:t>
                   </w:r>
                 </w:p>
               </w:tc>
@@ -2678,7 +2710,7 @@
                       <w:sz w:val="14"/>
                       <w:szCs w:val="14"/>
                     </w:rPr>
-                    <w:t xml:space="preserve">МБОУ «СОШ № ___»</w:t>
+                    <w:t xml:space="preserve">Школа № 12</w:t>
                   </w:r>
                 </w:p>
               </w:tc>
@@ -2772,7 +2804,7 @@
                       <w:sz w:val="26"/>
                       <w:szCs w:val="26"/>
                     </w:rPr>
-                    <w:t xml:space="preserve">Фамилия</w:t>
+                    <w:t xml:space="preserve">Досбаев</w:t>
                   </w:r>
                 </w:p>
                 <w:p>
@@ -2789,7 +2821,7 @@
                       <w:sz w:val="26"/>
                       <w:szCs w:val="26"/>
                     </w:rPr>
-                    <w:t xml:space="preserve">Имя</w:t>
+                    <w:t xml:space="preserve">Константин</w:t>
                   </w:r>
                 </w:p>
               </w:tc>
@@ -2827,11 +2859,13 @@
                   <w:r>
                     <w:rPr>
                       <w:rFonts w:ascii="Arial" w:cs="Arial" w:eastAsia="Arial" w:hAnsi="Arial"/>
+                      <w:b/>
+                      <w:bCs/>
                       <w:color w:val="111111"/>
                       <w:sz w:val="17"/>
                       <w:szCs w:val="17"/>
                     </w:rPr>
-                    <w:t xml:space="preserve">_____________</w:t>
+                    <w:t xml:space="preserve">музыка</w:t>
                   </w:r>
                 </w:p>
                 <w:p>
@@ -2851,11 +2885,13 @@
                   <w:r>
                     <w:rPr>
                       <w:rFonts w:ascii="Arial" w:cs="Arial" w:eastAsia="Arial" w:hAnsi="Arial"/>
+                      <w:b/>
+                      <w:bCs/>
                       <w:color w:val="111111"/>
                       <w:sz w:val="17"/>
                       <w:szCs w:val="17"/>
                     </w:rPr>
-                    <w:t xml:space="preserve">_______</w:t>
+                    <w:t xml:space="preserve">11 «Б»</w:t>
                   </w:r>
                 </w:p>
               </w:tc>

</xml_diff>

<commit_message>
Simplify badge: keep only role, name, subject and class
Co-Authored-By: Claude Opus 5.5 <noreply@anthropic.com>
Claude-Session: https://claude.ai/code/session_0149sWXEwDW8TGDudhT4YAQy
</commit_message>
<xml_diff>
--- a/badge/badge_zamestitel_uchitelya.docx
+++ b/badge/badge_zamestitel_uchitelya.docx
@@ -79,58 +79,7 @@
             <w:tr>
               <w:trPr>
                 <w:cantSplit/>
-                <w:trHeight w:val="680" w:hRule="exact"/>
-              </w:trPr>
-              <w:tc>
-                <w:tcPr>
-                  <w:tcW w:type="dxa" w:w="3119"/>
-                  <w:shd w:fill="000000" w:color="auto" w:val="clear"/>
-                  <w:tcMar>
-                    <w:top w:type="dxa" w:w="0"/>
-                    <w:left w:type="dxa" w:w="85"/>
-                    <w:bottom w:type="dxa" w:w="0"/>
-                    <w:right w:type="dxa" w:w="85"/>
-                  </w:tcMar>
-                  <w:vAlign w:val="center"/>
-                </w:tcPr>
-                <w:p>
-                  <w:pPr>
-                    <w:spacing w:after="0" w:before="0" w:line="240"/>
-                    <w:jc w:val="center"/>
-                  </w:pPr>
-                  <w:r>
-                    <w:rPr>
-                      <w:rFonts w:ascii="Arial" w:cs="Arial" w:eastAsia="Arial" w:hAnsi="Arial"/>
-                      <w:b/>
-                      <w:bCs/>
-                      <w:color w:val="FFFFFF"/>
-                      <w:sz w:val="20"/>
-                      <w:szCs w:val="20"/>
-                    </w:rPr>
-                    <w:t xml:space="preserve">ДЕНЬ САМОУПРАВЛЕНИЯ</w:t>
-                  </w:r>
-                </w:p>
-                <w:p>
-                  <w:pPr>
-                    <w:spacing w:after="0" w:before="40"/>
-                    <w:jc w:val="center"/>
-                  </w:pPr>
-                  <w:r>
-                    <w:rPr>
-                      <w:rFonts w:ascii="Arial" w:cs="Arial" w:eastAsia="Arial" w:hAnsi="Arial"/>
-                      <w:color w:val="FFFFFF"/>
-                      <w:sz w:val="14"/>
-                      <w:szCs w:val="14"/>
-                    </w:rPr>
-                    <w:t xml:space="preserve">Школа № 12</w:t>
-                  </w:r>
-                </w:p>
-              </w:tc>
-            </w:tr>
-            <w:tr>
-              <w:trPr>
-                <w:cantSplit/>
-                <w:trHeight w:val="907" w:hRule="exact"/>
+                <w:trHeight w:val="1247" w:hRule="exact"/>
               </w:trPr>
               <w:tc>
                 <w:tcPr>
@@ -155,25 +104,25 @@
                       <w:b/>
                       <w:bCs/>
                       <w:color w:val="000000"/>
-                      <w:sz w:val="26"/>
-                      <w:szCs w:val="26"/>
+                      <w:sz w:val="30"/>
+                      <w:szCs w:val="30"/>
                     </w:rPr>
                     <w:t xml:space="preserve">ЗАМЕСТИТЕЛЬ</w:t>
                   </w:r>
                 </w:p>
                 <w:p>
                   <w:pPr>
-                    <w:spacing w:after="0" w:before="0" w:line="240"/>
-                    <w:jc w:val="center"/>
-                  </w:pPr>
-                  <w:r>
-                    <w:rPr>
-                      <w:rFonts w:ascii="Arial" w:cs="Arial" w:eastAsia="Arial" w:hAnsi="Arial"/>
-                      <w:b/>
-                      <w:bCs/>
-                      <w:color w:val="000000"/>
-                      <w:sz w:val="26"/>
-                      <w:szCs w:val="26"/>
+                    <w:spacing w:after="0" w:before="40"/>
+                    <w:jc w:val="center"/>
+                  </w:pPr>
+                  <w:r>
+                    <w:rPr>
+                      <w:rFonts w:ascii="Arial" w:cs="Arial" w:eastAsia="Arial" w:hAnsi="Arial"/>
+                      <w:b/>
+                      <w:bCs/>
+                      <w:color w:val="000000"/>
+                      <w:sz w:val="30"/>
+                      <w:szCs w:val="30"/>
                     </w:rPr>
                     <w:t xml:space="preserve">УЧИТЕЛЯ</w:t>
                   </w:r>
@@ -183,7 +132,7 @@
             <w:tr>
               <w:trPr>
                 <w:cantSplit/>
-                <w:trHeight w:val="1361" w:hRule="exact"/>
+                <w:trHeight w:val="1814" w:hRule="exact"/>
               </w:trPr>
               <w:tc>
                 <w:tcPr>
@@ -212,26 +161,26 @@
                       <w:rFonts w:ascii="Arial" w:cs="Arial" w:eastAsia="Arial" w:hAnsi="Arial"/>
                       <w:b/>
                       <w:bCs/>
-                      <w:color w:val="111111"/>
-                      <w:sz w:val="26"/>
-                      <w:szCs w:val="26"/>
+                      <w:color w:val="000000"/>
+                      <w:sz w:val="32"/>
+                      <w:szCs w:val="32"/>
                     </w:rPr>
                     <w:t xml:space="preserve">Досбаев</w:t>
                   </w:r>
                 </w:p>
                 <w:p>
                   <w:pPr>
-                    <w:spacing w:after="0" w:before="60"/>
-                    <w:jc w:val="center"/>
-                  </w:pPr>
-                  <w:r>
-                    <w:rPr>
-                      <w:rFonts w:ascii="Arial" w:cs="Arial" w:eastAsia="Arial" w:hAnsi="Arial"/>
-                      <w:b/>
-                      <w:bCs/>
-                      <w:color w:val="111111"/>
-                      <w:sz w:val="26"/>
-                      <w:szCs w:val="26"/>
+                    <w:spacing w:after="0" w:before="100"/>
+                    <w:jc w:val="center"/>
+                  </w:pPr>
+                  <w:r>
+                    <w:rPr>
+                      <w:rFonts w:ascii="Arial" w:cs="Arial" w:eastAsia="Arial" w:hAnsi="Arial"/>
+                      <w:b/>
+                      <w:bCs/>
+                      <w:color w:val="000000"/>
+                      <w:sz w:val="32"/>
+                      <w:szCs w:val="32"/>
                     </w:rPr>
                     <w:t xml:space="preserve">Константин</w:t>
                   </w:r>
@@ -241,7 +190,7 @@
             <w:tr>
               <w:trPr>
                 <w:cantSplit/>
-                <w:trHeight w:val="510" w:hRule="exact"/>
+                <w:trHeight w:val="794" w:hRule="exact"/>
               </w:trPr>
               <w:tc>
                 <w:tcPr>
@@ -263,8 +212,8 @@
                     <w:rPr>
                       <w:rFonts w:ascii="Arial" w:cs="Arial" w:eastAsia="Arial" w:hAnsi="Arial"/>
                       <w:color w:val="333333"/>
-                      <w:sz w:val="17"/>
-                      <w:szCs w:val="17"/>
+                      <w:sz w:val="22"/>
+                      <w:szCs w:val="22"/>
                     </w:rPr>
                     <w:t xml:space="preserve">Предмет: </w:t>
                   </w:r>
@@ -273,24 +222,24 @@
                       <w:rFonts w:ascii="Arial" w:cs="Arial" w:eastAsia="Arial" w:hAnsi="Arial"/>
                       <w:b/>
                       <w:bCs/>
-                      <w:color w:val="111111"/>
-                      <w:sz w:val="17"/>
-                      <w:szCs w:val="17"/>
+                      <w:color w:val="000000"/>
+                      <w:sz w:val="22"/>
+                      <w:szCs w:val="22"/>
                     </w:rPr>
                     <w:t xml:space="preserve">музыка</w:t>
                   </w:r>
                 </w:p>
                 <w:p>
                   <w:pPr>
-                    <w:spacing w:after="0" w:before="20"/>
+                    <w:spacing w:after="0" w:before="60"/>
                     <w:jc w:val="center"/>
                   </w:pPr>
                   <w:r>
                     <w:rPr>
                       <w:rFonts w:ascii="Arial" w:cs="Arial" w:eastAsia="Arial" w:hAnsi="Arial"/>
                       <w:color w:val="333333"/>
-                      <w:sz w:val="17"/>
-                      <w:szCs w:val="17"/>
+                      <w:sz w:val="22"/>
+                      <w:szCs w:val="22"/>
                     </w:rPr>
                     <w:t xml:space="preserve">Класс: </w:t>
                   </w:r>
@@ -299,52 +248,11 @@
                       <w:rFonts w:ascii="Arial" w:cs="Arial" w:eastAsia="Arial" w:hAnsi="Arial"/>
                       <w:b/>
                       <w:bCs/>
-                      <w:color w:val="111111"/>
-                      <w:sz w:val="17"/>
-                      <w:szCs w:val="17"/>
+                      <w:color w:val="000000"/>
+                      <w:sz w:val="22"/>
+                      <w:szCs w:val="22"/>
                     </w:rPr>
                     <w:t xml:space="preserve">11 «Б»</w:t>
-                  </w:r>
-                </w:p>
-              </w:tc>
-            </w:tr>
-            <w:tr>
-              <w:trPr>
-                <w:cantSplit/>
-                <w:trHeight w:val="397" w:hRule="exact"/>
-              </w:trPr>
-              <w:tc>
-                <w:tcPr>
-                  <w:tcW w:type="dxa" w:w="3119"/>
-                  <w:tcBorders>
-                    <w:top w:val="single" w:color="000000" w:sz="12"/>
-                    <w:left w:val="none" w:color="FFFFFF" w:sz="0"/>
-                    <w:bottom w:val="none" w:color="FFFFFF" w:sz="0"/>
-                    <w:right w:val="none" w:color="FFFFFF" w:sz="0"/>
-                  </w:tcBorders>
-                  <w:tcMar>
-                    <w:top w:type="dxa" w:w="0"/>
-                    <w:left w:type="dxa" w:w="85"/>
-                    <w:bottom w:type="dxa" w:w="0"/>
-                    <w:right w:type="dxa" w:w="85"/>
-                  </w:tcMar>
-                  <w:vAlign w:val="center"/>
-                </w:tcPr>
-                <w:p>
-                  <w:pPr>
-                    <w:spacing w:after="0" w:before="0" w:line="240"/>
-                    <w:jc w:val="center"/>
-                  </w:pPr>
-                  <w:r>
-                    <w:rPr>
-                      <w:rFonts w:ascii="Arial" w:cs="Arial" w:eastAsia="Arial" w:hAnsi="Arial"/>
-                      <w:b/>
-                      <w:bCs/>
-                      <w:color w:val="000000"/>
-                      <w:sz w:val="16"/>
-                      <w:szCs w:val="16"/>
-                    </w:rPr>
-                    <w:t xml:space="preserve">5 октября 2026 г.</w:t>
                   </w:r>
                 </w:p>
               </w:tc>
@@ -401,58 +309,7 @@
             <w:tr>
               <w:trPr>
                 <w:cantSplit/>
-                <w:trHeight w:val="680" w:hRule="exact"/>
-              </w:trPr>
-              <w:tc>
-                <w:tcPr>
-                  <w:tcW w:type="dxa" w:w="3119"/>
-                  <w:shd w:fill="000000" w:color="auto" w:val="clear"/>
-                  <w:tcMar>
-                    <w:top w:type="dxa" w:w="0"/>
-                    <w:left w:type="dxa" w:w="85"/>
-                    <w:bottom w:type="dxa" w:w="0"/>
-                    <w:right w:type="dxa" w:w="85"/>
-                  </w:tcMar>
-                  <w:vAlign w:val="center"/>
-                </w:tcPr>
-                <w:p>
-                  <w:pPr>
-                    <w:spacing w:after="0" w:before="0" w:line="240"/>
-                    <w:jc w:val="center"/>
-                  </w:pPr>
-                  <w:r>
-                    <w:rPr>
-                      <w:rFonts w:ascii="Arial" w:cs="Arial" w:eastAsia="Arial" w:hAnsi="Arial"/>
-                      <w:b/>
-                      <w:bCs/>
-                      <w:color w:val="FFFFFF"/>
-                      <w:sz w:val="20"/>
-                      <w:szCs w:val="20"/>
-                    </w:rPr>
-                    <w:t xml:space="preserve">ДЕНЬ САМОУПРАВЛЕНИЯ</w:t>
-                  </w:r>
-                </w:p>
-                <w:p>
-                  <w:pPr>
-                    <w:spacing w:after="0" w:before="40"/>
-                    <w:jc w:val="center"/>
-                  </w:pPr>
-                  <w:r>
-                    <w:rPr>
-                      <w:rFonts w:ascii="Arial" w:cs="Arial" w:eastAsia="Arial" w:hAnsi="Arial"/>
-                      <w:color w:val="FFFFFF"/>
-                      <w:sz w:val="14"/>
-                      <w:szCs w:val="14"/>
-                    </w:rPr>
-                    <w:t xml:space="preserve">Школа № 12</w:t>
-                  </w:r>
-                </w:p>
-              </w:tc>
-            </w:tr>
-            <w:tr>
-              <w:trPr>
-                <w:cantSplit/>
-                <w:trHeight w:val="907" w:hRule="exact"/>
+                <w:trHeight w:val="1247" w:hRule="exact"/>
               </w:trPr>
               <w:tc>
                 <w:tcPr>
@@ -477,25 +334,25 @@
                       <w:b/>
                       <w:bCs/>
                       <w:color w:val="000000"/>
-                      <w:sz w:val="26"/>
-                      <w:szCs w:val="26"/>
+                      <w:sz w:val="30"/>
+                      <w:szCs w:val="30"/>
                     </w:rPr>
                     <w:t xml:space="preserve">ЗАМЕСТИТЕЛЬ</w:t>
                   </w:r>
                 </w:p>
                 <w:p>
                   <w:pPr>
-                    <w:spacing w:after="0" w:before="0" w:line="240"/>
-                    <w:jc w:val="center"/>
-                  </w:pPr>
-                  <w:r>
-                    <w:rPr>
-                      <w:rFonts w:ascii="Arial" w:cs="Arial" w:eastAsia="Arial" w:hAnsi="Arial"/>
-                      <w:b/>
-                      <w:bCs/>
-                      <w:color w:val="000000"/>
-                      <w:sz w:val="26"/>
-                      <w:szCs w:val="26"/>
+                    <w:spacing w:after="0" w:before="40"/>
+                    <w:jc w:val="center"/>
+                  </w:pPr>
+                  <w:r>
+                    <w:rPr>
+                      <w:rFonts w:ascii="Arial" w:cs="Arial" w:eastAsia="Arial" w:hAnsi="Arial"/>
+                      <w:b/>
+                      <w:bCs/>
+                      <w:color w:val="000000"/>
+                      <w:sz w:val="30"/>
+                      <w:szCs w:val="30"/>
                     </w:rPr>
                     <w:t xml:space="preserve">УЧИТЕЛЯ</w:t>
                   </w:r>
@@ -505,7 +362,7 @@
             <w:tr>
               <w:trPr>
                 <w:cantSplit/>
-                <w:trHeight w:val="1361" w:hRule="exact"/>
+                <w:trHeight w:val="1814" w:hRule="exact"/>
               </w:trPr>
               <w:tc>
                 <w:tcPr>
@@ -534,26 +391,26 @@
                       <w:rFonts w:ascii="Arial" w:cs="Arial" w:eastAsia="Arial" w:hAnsi="Arial"/>
                       <w:b/>
                       <w:bCs/>
-                      <w:color w:val="111111"/>
-                      <w:sz w:val="26"/>
-                      <w:szCs w:val="26"/>
+                      <w:color w:val="000000"/>
+                      <w:sz w:val="32"/>
+                      <w:szCs w:val="32"/>
                     </w:rPr>
                     <w:t xml:space="preserve">Досбаев</w:t>
                   </w:r>
                 </w:p>
                 <w:p>
                   <w:pPr>
-                    <w:spacing w:after="0" w:before="60"/>
-                    <w:jc w:val="center"/>
-                  </w:pPr>
-                  <w:r>
-                    <w:rPr>
-                      <w:rFonts w:ascii="Arial" w:cs="Arial" w:eastAsia="Arial" w:hAnsi="Arial"/>
-                      <w:b/>
-                      <w:bCs/>
-                      <w:color w:val="111111"/>
-                      <w:sz w:val="26"/>
-                      <w:szCs w:val="26"/>
+                    <w:spacing w:after="0" w:before="100"/>
+                    <w:jc w:val="center"/>
+                  </w:pPr>
+                  <w:r>
+                    <w:rPr>
+                      <w:rFonts w:ascii="Arial" w:cs="Arial" w:eastAsia="Arial" w:hAnsi="Arial"/>
+                      <w:b/>
+                      <w:bCs/>
+                      <w:color w:val="000000"/>
+                      <w:sz w:val="32"/>
+                      <w:szCs w:val="32"/>
                     </w:rPr>
                     <w:t xml:space="preserve">Константин</w:t>
                   </w:r>
@@ -563,7 +420,7 @@
             <w:tr>
               <w:trPr>
                 <w:cantSplit/>
-                <w:trHeight w:val="510" w:hRule="exact"/>
+                <w:trHeight w:val="794" w:hRule="exact"/>
               </w:trPr>
               <w:tc>
                 <w:tcPr>
@@ -585,8 +442,8 @@
                     <w:rPr>
                       <w:rFonts w:ascii="Arial" w:cs="Arial" w:eastAsia="Arial" w:hAnsi="Arial"/>
                       <w:color w:val="333333"/>
-                      <w:sz w:val="17"/>
-                      <w:szCs w:val="17"/>
+                      <w:sz w:val="22"/>
+                      <w:szCs w:val="22"/>
                     </w:rPr>
                     <w:t xml:space="preserve">Предмет: </w:t>
                   </w:r>
@@ -595,24 +452,24 @@
                       <w:rFonts w:ascii="Arial" w:cs="Arial" w:eastAsia="Arial" w:hAnsi="Arial"/>
                       <w:b/>
                       <w:bCs/>
-                      <w:color w:val="111111"/>
-                      <w:sz w:val="17"/>
-                      <w:szCs w:val="17"/>
+                      <w:color w:val="000000"/>
+                      <w:sz w:val="22"/>
+                      <w:szCs w:val="22"/>
                     </w:rPr>
                     <w:t xml:space="preserve">музыка</w:t>
                   </w:r>
                 </w:p>
                 <w:p>
                   <w:pPr>
-                    <w:spacing w:after="0" w:before="20"/>
+                    <w:spacing w:after="0" w:before="60"/>
                     <w:jc w:val="center"/>
                   </w:pPr>
                   <w:r>
                     <w:rPr>
                       <w:rFonts w:ascii="Arial" w:cs="Arial" w:eastAsia="Arial" w:hAnsi="Arial"/>
                       <w:color w:val="333333"/>
-                      <w:sz w:val="17"/>
-                      <w:szCs w:val="17"/>
+                      <w:sz w:val="22"/>
+                      <w:szCs w:val="22"/>
                     </w:rPr>
                     <w:t xml:space="preserve">Класс: </w:t>
                   </w:r>
@@ -621,52 +478,11 @@
                       <w:rFonts w:ascii="Arial" w:cs="Arial" w:eastAsia="Arial" w:hAnsi="Arial"/>
                       <w:b/>
                       <w:bCs/>
-                      <w:color w:val="111111"/>
-                      <w:sz w:val="17"/>
-                      <w:szCs w:val="17"/>
+                      <w:color w:val="000000"/>
+                      <w:sz w:val="22"/>
+                      <w:szCs w:val="22"/>
                     </w:rPr>
                     <w:t xml:space="preserve">11 «Б»</w:t>
-                  </w:r>
-                </w:p>
-              </w:tc>
-            </w:tr>
-            <w:tr>
-              <w:trPr>
-                <w:cantSplit/>
-                <w:trHeight w:val="397" w:hRule="exact"/>
-              </w:trPr>
-              <w:tc>
-                <w:tcPr>
-                  <w:tcW w:type="dxa" w:w="3119"/>
-                  <w:tcBorders>
-                    <w:top w:val="single" w:color="000000" w:sz="12"/>
-                    <w:left w:val="none" w:color="FFFFFF" w:sz="0"/>
-                    <w:bottom w:val="none" w:color="FFFFFF" w:sz="0"/>
-                    <w:right w:val="none" w:color="FFFFFF" w:sz="0"/>
-                  </w:tcBorders>
-                  <w:tcMar>
-                    <w:top w:type="dxa" w:w="0"/>
-                    <w:left w:type="dxa" w:w="85"/>
-                    <w:bottom w:type="dxa" w:w="0"/>
-                    <w:right w:type="dxa" w:w="85"/>
-                  </w:tcMar>
-                  <w:vAlign w:val="center"/>
-                </w:tcPr>
-                <w:p>
-                  <w:pPr>
-                    <w:spacing w:after="0" w:before="0" w:line="240"/>
-                    <w:jc w:val="center"/>
-                  </w:pPr>
-                  <w:r>
-                    <w:rPr>
-                      <w:rFonts w:ascii="Arial" w:cs="Arial" w:eastAsia="Arial" w:hAnsi="Arial"/>
-                      <w:b/>
-                      <w:bCs/>
-                      <w:color w:val="000000"/>
-                      <w:sz w:val="16"/>
-                      <w:szCs w:val="16"/>
-                    </w:rPr>
-                    <w:t xml:space="preserve">5 октября 2026 г.</w:t>
                   </w:r>
                 </w:p>
               </w:tc>
@@ -723,58 +539,7 @@
             <w:tr>
               <w:trPr>
                 <w:cantSplit/>
-                <w:trHeight w:val="680" w:hRule="exact"/>
-              </w:trPr>
-              <w:tc>
-                <w:tcPr>
-                  <w:tcW w:type="dxa" w:w="3119"/>
-                  <w:shd w:fill="000000" w:color="auto" w:val="clear"/>
-                  <w:tcMar>
-                    <w:top w:type="dxa" w:w="0"/>
-                    <w:left w:type="dxa" w:w="85"/>
-                    <w:bottom w:type="dxa" w:w="0"/>
-                    <w:right w:type="dxa" w:w="85"/>
-                  </w:tcMar>
-                  <w:vAlign w:val="center"/>
-                </w:tcPr>
-                <w:p>
-                  <w:pPr>
-                    <w:spacing w:after="0" w:before="0" w:line="240"/>
-                    <w:jc w:val="center"/>
-                  </w:pPr>
-                  <w:r>
-                    <w:rPr>
-                      <w:rFonts w:ascii="Arial" w:cs="Arial" w:eastAsia="Arial" w:hAnsi="Arial"/>
-                      <w:b/>
-                      <w:bCs/>
-                      <w:color w:val="FFFFFF"/>
-                      <w:sz w:val="20"/>
-                      <w:szCs w:val="20"/>
-                    </w:rPr>
-                    <w:t xml:space="preserve">ДЕНЬ САМОУПРАВЛЕНИЯ</w:t>
-                  </w:r>
-                </w:p>
-                <w:p>
-                  <w:pPr>
-                    <w:spacing w:after="0" w:before="40"/>
-                    <w:jc w:val="center"/>
-                  </w:pPr>
-                  <w:r>
-                    <w:rPr>
-                      <w:rFonts w:ascii="Arial" w:cs="Arial" w:eastAsia="Arial" w:hAnsi="Arial"/>
-                      <w:color w:val="FFFFFF"/>
-                      <w:sz w:val="14"/>
-                      <w:szCs w:val="14"/>
-                    </w:rPr>
-                    <w:t xml:space="preserve">Школа № 12</w:t>
-                  </w:r>
-                </w:p>
-              </w:tc>
-            </w:tr>
-            <w:tr>
-              <w:trPr>
-                <w:cantSplit/>
-                <w:trHeight w:val="907" w:hRule="exact"/>
+                <w:trHeight w:val="1247" w:hRule="exact"/>
               </w:trPr>
               <w:tc>
                 <w:tcPr>
@@ -799,25 +564,25 @@
                       <w:b/>
                       <w:bCs/>
                       <w:color w:val="000000"/>
-                      <w:sz w:val="26"/>
-                      <w:szCs w:val="26"/>
+                      <w:sz w:val="30"/>
+                      <w:szCs w:val="30"/>
                     </w:rPr>
                     <w:t xml:space="preserve">ЗАМЕСТИТЕЛЬ</w:t>
                   </w:r>
                 </w:p>
                 <w:p>
                   <w:pPr>
-                    <w:spacing w:after="0" w:before="0" w:line="240"/>
-                    <w:jc w:val="center"/>
-                  </w:pPr>
-                  <w:r>
-                    <w:rPr>
-                      <w:rFonts w:ascii="Arial" w:cs="Arial" w:eastAsia="Arial" w:hAnsi="Arial"/>
-                      <w:b/>
-                      <w:bCs/>
-                      <w:color w:val="000000"/>
-                      <w:sz w:val="26"/>
-                      <w:szCs w:val="26"/>
+                    <w:spacing w:after="0" w:before="40"/>
+                    <w:jc w:val="center"/>
+                  </w:pPr>
+                  <w:r>
+                    <w:rPr>
+                      <w:rFonts w:ascii="Arial" w:cs="Arial" w:eastAsia="Arial" w:hAnsi="Arial"/>
+                      <w:b/>
+                      <w:bCs/>
+                      <w:color w:val="000000"/>
+                      <w:sz w:val="30"/>
+                      <w:szCs w:val="30"/>
                     </w:rPr>
                     <w:t xml:space="preserve">УЧИТЕЛЯ</w:t>
                   </w:r>
@@ -827,7 +592,7 @@
             <w:tr>
               <w:trPr>
                 <w:cantSplit/>
-                <w:trHeight w:val="1361" w:hRule="exact"/>
+                <w:trHeight w:val="1814" w:hRule="exact"/>
               </w:trPr>
               <w:tc>
                 <w:tcPr>
@@ -856,26 +621,26 @@
                       <w:rFonts w:ascii="Arial" w:cs="Arial" w:eastAsia="Arial" w:hAnsi="Arial"/>
                       <w:b/>
                       <w:bCs/>
-                      <w:color w:val="111111"/>
-                      <w:sz w:val="26"/>
-                      <w:szCs w:val="26"/>
+                      <w:color w:val="000000"/>
+                      <w:sz w:val="32"/>
+                      <w:szCs w:val="32"/>
                     </w:rPr>
                     <w:t xml:space="preserve">Досбаев</w:t>
                   </w:r>
                 </w:p>
                 <w:p>
                   <w:pPr>
-                    <w:spacing w:after="0" w:before="60"/>
-                    <w:jc w:val="center"/>
-                  </w:pPr>
-                  <w:r>
-                    <w:rPr>
-                      <w:rFonts w:ascii="Arial" w:cs="Arial" w:eastAsia="Arial" w:hAnsi="Arial"/>
-                      <w:b/>
-                      <w:bCs/>
-                      <w:color w:val="111111"/>
-                      <w:sz w:val="26"/>
-                      <w:szCs w:val="26"/>
+                    <w:spacing w:after="0" w:before="100"/>
+                    <w:jc w:val="center"/>
+                  </w:pPr>
+                  <w:r>
+                    <w:rPr>
+                      <w:rFonts w:ascii="Arial" w:cs="Arial" w:eastAsia="Arial" w:hAnsi="Arial"/>
+                      <w:b/>
+                      <w:bCs/>
+                      <w:color w:val="000000"/>
+                      <w:sz w:val="32"/>
+                      <w:szCs w:val="32"/>
                     </w:rPr>
                     <w:t xml:space="preserve">Константин</w:t>
                   </w:r>
@@ -885,7 +650,7 @@
             <w:tr>
               <w:trPr>
                 <w:cantSplit/>
-                <w:trHeight w:val="510" w:hRule="exact"/>
+                <w:trHeight w:val="794" w:hRule="exact"/>
               </w:trPr>
               <w:tc>
                 <w:tcPr>
@@ -907,8 +672,8 @@
                     <w:rPr>
                       <w:rFonts w:ascii="Arial" w:cs="Arial" w:eastAsia="Arial" w:hAnsi="Arial"/>
                       <w:color w:val="333333"/>
-                      <w:sz w:val="17"/>
-                      <w:szCs w:val="17"/>
+                      <w:sz w:val="22"/>
+                      <w:szCs w:val="22"/>
                     </w:rPr>
                     <w:t xml:space="preserve">Предмет: </w:t>
                   </w:r>
@@ -917,24 +682,24 @@
                       <w:rFonts w:ascii="Arial" w:cs="Arial" w:eastAsia="Arial" w:hAnsi="Arial"/>
                       <w:b/>
                       <w:bCs/>
-                      <w:color w:val="111111"/>
-                      <w:sz w:val="17"/>
-                      <w:szCs w:val="17"/>
+                      <w:color w:val="000000"/>
+                      <w:sz w:val="22"/>
+                      <w:szCs w:val="22"/>
                     </w:rPr>
                     <w:t xml:space="preserve">музыка</w:t>
                   </w:r>
                 </w:p>
                 <w:p>
                   <w:pPr>
-                    <w:spacing w:after="0" w:before="20"/>
+                    <w:spacing w:after="0" w:before="60"/>
                     <w:jc w:val="center"/>
                   </w:pPr>
                   <w:r>
                     <w:rPr>
                       <w:rFonts w:ascii="Arial" w:cs="Arial" w:eastAsia="Arial" w:hAnsi="Arial"/>
                       <w:color w:val="333333"/>
-                      <w:sz w:val="17"/>
-                      <w:szCs w:val="17"/>
+                      <w:sz w:val="22"/>
+                      <w:szCs w:val="22"/>
                     </w:rPr>
                     <w:t xml:space="preserve">Класс: </w:t>
                   </w:r>
@@ -943,52 +708,11 @@
                       <w:rFonts w:ascii="Arial" w:cs="Arial" w:eastAsia="Arial" w:hAnsi="Arial"/>
                       <w:b/>
                       <w:bCs/>
-                      <w:color w:val="111111"/>
-                      <w:sz w:val="17"/>
-                      <w:szCs w:val="17"/>
+                      <w:color w:val="000000"/>
+                      <w:sz w:val="22"/>
+                      <w:szCs w:val="22"/>
                     </w:rPr>
                     <w:t xml:space="preserve">11 «Б»</w:t>
-                  </w:r>
-                </w:p>
-              </w:tc>
-            </w:tr>
-            <w:tr>
-              <w:trPr>
-                <w:cantSplit/>
-                <w:trHeight w:val="397" w:hRule="exact"/>
-              </w:trPr>
-              <w:tc>
-                <w:tcPr>
-                  <w:tcW w:type="dxa" w:w="3119"/>
-                  <w:tcBorders>
-                    <w:top w:val="single" w:color="000000" w:sz="12"/>
-                    <w:left w:val="none" w:color="FFFFFF" w:sz="0"/>
-                    <w:bottom w:val="none" w:color="FFFFFF" w:sz="0"/>
-                    <w:right w:val="none" w:color="FFFFFF" w:sz="0"/>
-                  </w:tcBorders>
-                  <w:tcMar>
-                    <w:top w:type="dxa" w:w="0"/>
-                    <w:left w:type="dxa" w:w="85"/>
-                    <w:bottom w:type="dxa" w:w="0"/>
-                    <w:right w:type="dxa" w:w="85"/>
-                  </w:tcMar>
-                  <w:vAlign w:val="center"/>
-                </w:tcPr>
-                <w:p>
-                  <w:pPr>
-                    <w:spacing w:after="0" w:before="0" w:line="240"/>
-                    <w:jc w:val="center"/>
-                  </w:pPr>
-                  <w:r>
-                    <w:rPr>
-                      <w:rFonts w:ascii="Arial" w:cs="Arial" w:eastAsia="Arial" w:hAnsi="Arial"/>
-                      <w:b/>
-                      <w:bCs/>
-                      <w:color w:val="000000"/>
-                      <w:sz w:val="16"/>
-                      <w:szCs w:val="16"/>
-                    </w:rPr>
-                    <w:t xml:space="preserve">5 октября 2026 г.</w:t>
                   </w:r>
                 </w:p>
               </w:tc>
@@ -1051,58 +775,7 @@
             <w:tr>
               <w:trPr>
                 <w:cantSplit/>
-                <w:trHeight w:val="680" w:hRule="exact"/>
-              </w:trPr>
-              <w:tc>
-                <w:tcPr>
-                  <w:tcW w:type="dxa" w:w="3119"/>
-                  <w:shd w:fill="000000" w:color="auto" w:val="clear"/>
-                  <w:tcMar>
-                    <w:top w:type="dxa" w:w="0"/>
-                    <w:left w:type="dxa" w:w="85"/>
-                    <w:bottom w:type="dxa" w:w="0"/>
-                    <w:right w:type="dxa" w:w="85"/>
-                  </w:tcMar>
-                  <w:vAlign w:val="center"/>
-                </w:tcPr>
-                <w:p>
-                  <w:pPr>
-                    <w:spacing w:after="0" w:before="0" w:line="240"/>
-                    <w:jc w:val="center"/>
-                  </w:pPr>
-                  <w:r>
-                    <w:rPr>
-                      <w:rFonts w:ascii="Arial" w:cs="Arial" w:eastAsia="Arial" w:hAnsi="Arial"/>
-                      <w:b/>
-                      <w:bCs/>
-                      <w:color w:val="FFFFFF"/>
-                      <w:sz w:val="20"/>
-                      <w:szCs w:val="20"/>
-                    </w:rPr>
-                    <w:t xml:space="preserve">ДЕНЬ САМОУПРАВЛЕНИЯ</w:t>
-                  </w:r>
-                </w:p>
-                <w:p>
-                  <w:pPr>
-                    <w:spacing w:after="0" w:before="40"/>
-                    <w:jc w:val="center"/>
-                  </w:pPr>
-                  <w:r>
-                    <w:rPr>
-                      <w:rFonts w:ascii="Arial" w:cs="Arial" w:eastAsia="Arial" w:hAnsi="Arial"/>
-                      <w:color w:val="FFFFFF"/>
-                      <w:sz w:val="14"/>
-                      <w:szCs w:val="14"/>
-                    </w:rPr>
-                    <w:t xml:space="preserve">Школа № 12</w:t>
-                  </w:r>
-                </w:p>
-              </w:tc>
-            </w:tr>
-            <w:tr>
-              <w:trPr>
-                <w:cantSplit/>
-                <w:trHeight w:val="907" w:hRule="exact"/>
+                <w:trHeight w:val="1247" w:hRule="exact"/>
               </w:trPr>
               <w:tc>
                 <w:tcPr>
@@ -1127,25 +800,25 @@
                       <w:b/>
                       <w:bCs/>
                       <w:color w:val="000000"/>
-                      <w:sz w:val="26"/>
-                      <w:szCs w:val="26"/>
+                      <w:sz w:val="30"/>
+                      <w:szCs w:val="30"/>
                     </w:rPr>
                     <w:t xml:space="preserve">ЗАМЕСТИТЕЛЬ</w:t>
                   </w:r>
                 </w:p>
                 <w:p>
                   <w:pPr>
-                    <w:spacing w:after="0" w:before="0" w:line="240"/>
-                    <w:jc w:val="center"/>
-                  </w:pPr>
-                  <w:r>
-                    <w:rPr>
-                      <w:rFonts w:ascii="Arial" w:cs="Arial" w:eastAsia="Arial" w:hAnsi="Arial"/>
-                      <w:b/>
-                      <w:bCs/>
-                      <w:color w:val="000000"/>
-                      <w:sz w:val="26"/>
-                      <w:szCs w:val="26"/>
+                    <w:spacing w:after="0" w:before="40"/>
+                    <w:jc w:val="center"/>
+                  </w:pPr>
+                  <w:r>
+                    <w:rPr>
+                      <w:rFonts w:ascii="Arial" w:cs="Arial" w:eastAsia="Arial" w:hAnsi="Arial"/>
+                      <w:b/>
+                      <w:bCs/>
+                      <w:color w:val="000000"/>
+                      <w:sz w:val="30"/>
+                      <w:szCs w:val="30"/>
                     </w:rPr>
                     <w:t xml:space="preserve">УЧИТЕЛЯ</w:t>
                   </w:r>
@@ -1155,7 +828,7 @@
             <w:tr>
               <w:trPr>
                 <w:cantSplit/>
-                <w:trHeight w:val="1361" w:hRule="exact"/>
+                <w:trHeight w:val="1814" w:hRule="exact"/>
               </w:trPr>
               <w:tc>
                 <w:tcPr>
@@ -1184,26 +857,26 @@
                       <w:rFonts w:ascii="Arial" w:cs="Arial" w:eastAsia="Arial" w:hAnsi="Arial"/>
                       <w:b/>
                       <w:bCs/>
-                      <w:color w:val="111111"/>
-                      <w:sz w:val="26"/>
-                      <w:szCs w:val="26"/>
+                      <w:color w:val="000000"/>
+                      <w:sz w:val="32"/>
+                      <w:szCs w:val="32"/>
                     </w:rPr>
                     <w:t xml:space="preserve">Досбаев</w:t>
                   </w:r>
                 </w:p>
                 <w:p>
                   <w:pPr>
-                    <w:spacing w:after="0" w:before="60"/>
-                    <w:jc w:val="center"/>
-                  </w:pPr>
-                  <w:r>
-                    <w:rPr>
-                      <w:rFonts w:ascii="Arial" w:cs="Arial" w:eastAsia="Arial" w:hAnsi="Arial"/>
-                      <w:b/>
-                      <w:bCs/>
-                      <w:color w:val="111111"/>
-                      <w:sz w:val="26"/>
-                      <w:szCs w:val="26"/>
+                    <w:spacing w:after="0" w:before="100"/>
+                    <w:jc w:val="center"/>
+                  </w:pPr>
+                  <w:r>
+                    <w:rPr>
+                      <w:rFonts w:ascii="Arial" w:cs="Arial" w:eastAsia="Arial" w:hAnsi="Arial"/>
+                      <w:b/>
+                      <w:bCs/>
+                      <w:color w:val="000000"/>
+                      <w:sz w:val="32"/>
+                      <w:szCs w:val="32"/>
                     </w:rPr>
                     <w:t xml:space="preserve">Константин</w:t>
                   </w:r>
@@ -1213,7 +886,7 @@
             <w:tr>
               <w:trPr>
                 <w:cantSplit/>
-                <w:trHeight w:val="510" w:hRule="exact"/>
+                <w:trHeight w:val="794" w:hRule="exact"/>
               </w:trPr>
               <w:tc>
                 <w:tcPr>
@@ -1235,8 +908,8 @@
                     <w:rPr>
                       <w:rFonts w:ascii="Arial" w:cs="Arial" w:eastAsia="Arial" w:hAnsi="Arial"/>
                       <w:color w:val="333333"/>
-                      <w:sz w:val="17"/>
-                      <w:szCs w:val="17"/>
+                      <w:sz w:val="22"/>
+                      <w:szCs w:val="22"/>
                     </w:rPr>
                     <w:t xml:space="preserve">Предмет: </w:t>
                   </w:r>
@@ -1245,24 +918,24 @@
                       <w:rFonts w:ascii="Arial" w:cs="Arial" w:eastAsia="Arial" w:hAnsi="Arial"/>
                       <w:b/>
                       <w:bCs/>
-                      <w:color w:val="111111"/>
-                      <w:sz w:val="17"/>
-                      <w:szCs w:val="17"/>
+                      <w:color w:val="000000"/>
+                      <w:sz w:val="22"/>
+                      <w:szCs w:val="22"/>
                     </w:rPr>
                     <w:t xml:space="preserve">музыка</w:t>
                   </w:r>
                 </w:p>
                 <w:p>
                   <w:pPr>
-                    <w:spacing w:after="0" w:before="20"/>
+                    <w:spacing w:after="0" w:before="60"/>
                     <w:jc w:val="center"/>
                   </w:pPr>
                   <w:r>
                     <w:rPr>
                       <w:rFonts w:ascii="Arial" w:cs="Arial" w:eastAsia="Arial" w:hAnsi="Arial"/>
                       <w:color w:val="333333"/>
-                      <w:sz w:val="17"/>
-                      <w:szCs w:val="17"/>
+                      <w:sz w:val="22"/>
+                      <w:szCs w:val="22"/>
                     </w:rPr>
                     <w:t xml:space="preserve">Класс: </w:t>
                   </w:r>
@@ -1271,52 +944,11 @@
                       <w:rFonts w:ascii="Arial" w:cs="Arial" w:eastAsia="Arial" w:hAnsi="Arial"/>
                       <w:b/>
                       <w:bCs/>
-                      <w:color w:val="111111"/>
-                      <w:sz w:val="17"/>
-                      <w:szCs w:val="17"/>
+                      <w:color w:val="000000"/>
+                      <w:sz w:val="22"/>
+                      <w:szCs w:val="22"/>
                     </w:rPr>
                     <w:t xml:space="preserve">11 «Б»</w:t>
-                  </w:r>
-                </w:p>
-              </w:tc>
-            </w:tr>
-            <w:tr>
-              <w:trPr>
-                <w:cantSplit/>
-                <w:trHeight w:val="397" w:hRule="exact"/>
-              </w:trPr>
-              <w:tc>
-                <w:tcPr>
-                  <w:tcW w:type="dxa" w:w="3119"/>
-                  <w:tcBorders>
-                    <w:top w:val="single" w:color="000000" w:sz="12"/>
-                    <w:left w:val="none" w:color="FFFFFF" w:sz="0"/>
-                    <w:bottom w:val="none" w:color="FFFFFF" w:sz="0"/>
-                    <w:right w:val="none" w:color="FFFFFF" w:sz="0"/>
-                  </w:tcBorders>
-                  <w:tcMar>
-                    <w:top w:type="dxa" w:w="0"/>
-                    <w:left w:type="dxa" w:w="85"/>
-                    <w:bottom w:type="dxa" w:w="0"/>
-                    <w:right w:type="dxa" w:w="85"/>
-                  </w:tcMar>
-                  <w:vAlign w:val="center"/>
-                </w:tcPr>
-                <w:p>
-                  <w:pPr>
-                    <w:spacing w:after="0" w:before="0" w:line="240"/>
-                    <w:jc w:val="center"/>
-                  </w:pPr>
-                  <w:r>
-                    <w:rPr>
-                      <w:rFonts w:ascii="Arial" w:cs="Arial" w:eastAsia="Arial" w:hAnsi="Arial"/>
-                      <w:b/>
-                      <w:bCs/>
-                      <w:color w:val="000000"/>
-                      <w:sz w:val="16"/>
-                      <w:szCs w:val="16"/>
-                    </w:rPr>
-                    <w:t xml:space="preserve">5 октября 2026 г.</w:t>
                   </w:r>
                 </w:p>
               </w:tc>
@@ -1373,58 +1005,7 @@
             <w:tr>
               <w:trPr>
                 <w:cantSplit/>
-                <w:trHeight w:val="680" w:hRule="exact"/>
-              </w:trPr>
-              <w:tc>
-                <w:tcPr>
-                  <w:tcW w:type="dxa" w:w="3119"/>
-                  <w:shd w:fill="000000" w:color="auto" w:val="clear"/>
-                  <w:tcMar>
-                    <w:top w:type="dxa" w:w="0"/>
-                    <w:left w:type="dxa" w:w="85"/>
-                    <w:bottom w:type="dxa" w:w="0"/>
-                    <w:right w:type="dxa" w:w="85"/>
-                  </w:tcMar>
-                  <w:vAlign w:val="center"/>
-                </w:tcPr>
-                <w:p>
-                  <w:pPr>
-                    <w:spacing w:after="0" w:before="0" w:line="240"/>
-                    <w:jc w:val="center"/>
-                  </w:pPr>
-                  <w:r>
-                    <w:rPr>
-                      <w:rFonts w:ascii="Arial" w:cs="Arial" w:eastAsia="Arial" w:hAnsi="Arial"/>
-                      <w:b/>
-                      <w:bCs/>
-                      <w:color w:val="FFFFFF"/>
-                      <w:sz w:val="20"/>
-                      <w:szCs w:val="20"/>
-                    </w:rPr>
-                    <w:t xml:space="preserve">ДЕНЬ САМОУПРАВЛЕНИЯ</w:t>
-                  </w:r>
-                </w:p>
-                <w:p>
-                  <w:pPr>
-                    <w:spacing w:after="0" w:before="40"/>
-                    <w:jc w:val="center"/>
-                  </w:pPr>
-                  <w:r>
-                    <w:rPr>
-                      <w:rFonts w:ascii="Arial" w:cs="Arial" w:eastAsia="Arial" w:hAnsi="Arial"/>
-                      <w:color w:val="FFFFFF"/>
-                      <w:sz w:val="14"/>
-                      <w:szCs w:val="14"/>
-                    </w:rPr>
-                    <w:t xml:space="preserve">Школа № 12</w:t>
-                  </w:r>
-                </w:p>
-              </w:tc>
-            </w:tr>
-            <w:tr>
-              <w:trPr>
-                <w:cantSplit/>
-                <w:trHeight w:val="907" w:hRule="exact"/>
+                <w:trHeight w:val="1247" w:hRule="exact"/>
               </w:trPr>
               <w:tc>
                 <w:tcPr>
@@ -1449,25 +1030,25 @@
                       <w:b/>
                       <w:bCs/>
                       <w:color w:val="000000"/>
-                      <w:sz w:val="26"/>
-                      <w:szCs w:val="26"/>
+                      <w:sz w:val="30"/>
+                      <w:szCs w:val="30"/>
                     </w:rPr>
                     <w:t xml:space="preserve">ЗАМЕСТИТЕЛЬ</w:t>
                   </w:r>
                 </w:p>
                 <w:p>
                   <w:pPr>
-                    <w:spacing w:after="0" w:before="0" w:line="240"/>
-                    <w:jc w:val="center"/>
-                  </w:pPr>
-                  <w:r>
-                    <w:rPr>
-                      <w:rFonts w:ascii="Arial" w:cs="Arial" w:eastAsia="Arial" w:hAnsi="Arial"/>
-                      <w:b/>
-                      <w:bCs/>
-                      <w:color w:val="000000"/>
-                      <w:sz w:val="26"/>
-                      <w:szCs w:val="26"/>
+                    <w:spacing w:after="0" w:before="40"/>
+                    <w:jc w:val="center"/>
+                  </w:pPr>
+                  <w:r>
+                    <w:rPr>
+                      <w:rFonts w:ascii="Arial" w:cs="Arial" w:eastAsia="Arial" w:hAnsi="Arial"/>
+                      <w:b/>
+                      <w:bCs/>
+                      <w:color w:val="000000"/>
+                      <w:sz w:val="30"/>
+                      <w:szCs w:val="30"/>
                     </w:rPr>
                     <w:t xml:space="preserve">УЧИТЕЛЯ</w:t>
                   </w:r>
@@ -1477,7 +1058,7 @@
             <w:tr>
               <w:trPr>
                 <w:cantSplit/>
-                <w:trHeight w:val="1361" w:hRule="exact"/>
+                <w:trHeight w:val="1814" w:hRule="exact"/>
               </w:trPr>
               <w:tc>
                 <w:tcPr>
@@ -1506,26 +1087,26 @@
                       <w:rFonts w:ascii="Arial" w:cs="Arial" w:eastAsia="Arial" w:hAnsi="Arial"/>
                       <w:b/>
                       <w:bCs/>
-                      <w:color w:val="111111"/>
-                      <w:sz w:val="26"/>
-                      <w:szCs w:val="26"/>
+                      <w:color w:val="000000"/>
+                      <w:sz w:val="32"/>
+                      <w:szCs w:val="32"/>
                     </w:rPr>
                     <w:t xml:space="preserve">Досбаев</w:t>
                   </w:r>
                 </w:p>
                 <w:p>
                   <w:pPr>
-                    <w:spacing w:after="0" w:before="60"/>
-                    <w:jc w:val="center"/>
-                  </w:pPr>
-                  <w:r>
-                    <w:rPr>
-                      <w:rFonts w:ascii="Arial" w:cs="Arial" w:eastAsia="Arial" w:hAnsi="Arial"/>
-                      <w:b/>
-                      <w:bCs/>
-                      <w:color w:val="111111"/>
-                      <w:sz w:val="26"/>
-                      <w:szCs w:val="26"/>
+                    <w:spacing w:after="0" w:before="100"/>
+                    <w:jc w:val="center"/>
+                  </w:pPr>
+                  <w:r>
+                    <w:rPr>
+                      <w:rFonts w:ascii="Arial" w:cs="Arial" w:eastAsia="Arial" w:hAnsi="Arial"/>
+                      <w:b/>
+                      <w:bCs/>
+                      <w:color w:val="000000"/>
+                      <w:sz w:val="32"/>
+                      <w:szCs w:val="32"/>
                     </w:rPr>
                     <w:t xml:space="preserve">Константин</w:t>
                   </w:r>
@@ -1535,7 +1116,7 @@
             <w:tr>
               <w:trPr>
                 <w:cantSplit/>
-                <w:trHeight w:val="510" w:hRule="exact"/>
+                <w:trHeight w:val="794" w:hRule="exact"/>
               </w:trPr>
               <w:tc>
                 <w:tcPr>
@@ -1557,8 +1138,8 @@
                     <w:rPr>
                       <w:rFonts w:ascii="Arial" w:cs="Arial" w:eastAsia="Arial" w:hAnsi="Arial"/>
                       <w:color w:val="333333"/>
-                      <w:sz w:val="17"/>
-                      <w:szCs w:val="17"/>
+                      <w:sz w:val="22"/>
+                      <w:szCs w:val="22"/>
                     </w:rPr>
                     <w:t xml:space="preserve">Предмет: </w:t>
                   </w:r>
@@ -1567,24 +1148,24 @@
                       <w:rFonts w:ascii="Arial" w:cs="Arial" w:eastAsia="Arial" w:hAnsi="Arial"/>
                       <w:b/>
                       <w:bCs/>
-                      <w:color w:val="111111"/>
-                      <w:sz w:val="17"/>
-                      <w:szCs w:val="17"/>
+                      <w:color w:val="000000"/>
+                      <w:sz w:val="22"/>
+                      <w:szCs w:val="22"/>
                     </w:rPr>
                     <w:t xml:space="preserve">музыка</w:t>
                   </w:r>
                 </w:p>
                 <w:p>
                   <w:pPr>
-                    <w:spacing w:after="0" w:before="20"/>
+                    <w:spacing w:after="0" w:before="60"/>
                     <w:jc w:val="center"/>
                   </w:pPr>
                   <w:r>
                     <w:rPr>
                       <w:rFonts w:ascii="Arial" w:cs="Arial" w:eastAsia="Arial" w:hAnsi="Arial"/>
                       <w:color w:val="333333"/>
-                      <w:sz w:val="17"/>
-                      <w:szCs w:val="17"/>
+                      <w:sz w:val="22"/>
+                      <w:szCs w:val="22"/>
                     </w:rPr>
                     <w:t xml:space="preserve">Класс: </w:t>
                   </w:r>
@@ -1593,52 +1174,11 @@
                       <w:rFonts w:ascii="Arial" w:cs="Arial" w:eastAsia="Arial" w:hAnsi="Arial"/>
                       <w:b/>
                       <w:bCs/>
-                      <w:color w:val="111111"/>
-                      <w:sz w:val="17"/>
-                      <w:szCs w:val="17"/>
+                      <w:color w:val="000000"/>
+                      <w:sz w:val="22"/>
+                      <w:szCs w:val="22"/>
                     </w:rPr>
                     <w:t xml:space="preserve">11 «Б»</w:t>
-                  </w:r>
-                </w:p>
-              </w:tc>
-            </w:tr>
-            <w:tr>
-              <w:trPr>
-                <w:cantSplit/>
-                <w:trHeight w:val="397" w:hRule="exact"/>
-              </w:trPr>
-              <w:tc>
-                <w:tcPr>
-                  <w:tcW w:type="dxa" w:w="3119"/>
-                  <w:tcBorders>
-                    <w:top w:val="single" w:color="000000" w:sz="12"/>
-                    <w:left w:val="none" w:color="FFFFFF" w:sz="0"/>
-                    <w:bottom w:val="none" w:color="FFFFFF" w:sz="0"/>
-                    <w:right w:val="none" w:color="FFFFFF" w:sz="0"/>
-                  </w:tcBorders>
-                  <w:tcMar>
-                    <w:top w:type="dxa" w:w="0"/>
-                    <w:left w:type="dxa" w:w="85"/>
-                    <w:bottom w:type="dxa" w:w="0"/>
-                    <w:right w:type="dxa" w:w="85"/>
-                  </w:tcMar>
-                  <w:vAlign w:val="center"/>
-                </w:tcPr>
-                <w:p>
-                  <w:pPr>
-                    <w:spacing w:after="0" w:before="0" w:line="240"/>
-                    <w:jc w:val="center"/>
-                  </w:pPr>
-                  <w:r>
-                    <w:rPr>
-                      <w:rFonts w:ascii="Arial" w:cs="Arial" w:eastAsia="Arial" w:hAnsi="Arial"/>
-                      <w:b/>
-                      <w:bCs/>
-                      <w:color w:val="000000"/>
-                      <w:sz w:val="16"/>
-                      <w:szCs w:val="16"/>
-                    </w:rPr>
-                    <w:t xml:space="preserve">5 октября 2026 г.</w:t>
                   </w:r>
                 </w:p>
               </w:tc>
@@ -1695,58 +1235,7 @@
             <w:tr>
               <w:trPr>
                 <w:cantSplit/>
-                <w:trHeight w:val="680" w:hRule="exact"/>
-              </w:trPr>
-              <w:tc>
-                <w:tcPr>
-                  <w:tcW w:type="dxa" w:w="3119"/>
-                  <w:shd w:fill="000000" w:color="auto" w:val="clear"/>
-                  <w:tcMar>
-                    <w:top w:type="dxa" w:w="0"/>
-                    <w:left w:type="dxa" w:w="85"/>
-                    <w:bottom w:type="dxa" w:w="0"/>
-                    <w:right w:type="dxa" w:w="85"/>
-                  </w:tcMar>
-                  <w:vAlign w:val="center"/>
-                </w:tcPr>
-                <w:p>
-                  <w:pPr>
-                    <w:spacing w:after="0" w:before="0" w:line="240"/>
-                    <w:jc w:val="center"/>
-                  </w:pPr>
-                  <w:r>
-                    <w:rPr>
-                      <w:rFonts w:ascii="Arial" w:cs="Arial" w:eastAsia="Arial" w:hAnsi="Arial"/>
-                      <w:b/>
-                      <w:bCs/>
-                      <w:color w:val="FFFFFF"/>
-                      <w:sz w:val="20"/>
-                      <w:szCs w:val="20"/>
-                    </w:rPr>
-                    <w:t xml:space="preserve">ДЕНЬ САМОУПРАВЛЕНИЯ</w:t>
-                  </w:r>
-                </w:p>
-                <w:p>
-                  <w:pPr>
-                    <w:spacing w:after="0" w:before="40"/>
-                    <w:jc w:val="center"/>
-                  </w:pPr>
-                  <w:r>
-                    <w:rPr>
-                      <w:rFonts w:ascii="Arial" w:cs="Arial" w:eastAsia="Arial" w:hAnsi="Arial"/>
-                      <w:color w:val="FFFFFF"/>
-                      <w:sz w:val="14"/>
-                      <w:szCs w:val="14"/>
-                    </w:rPr>
-                    <w:t xml:space="preserve">Школа № 12</w:t>
-                  </w:r>
-                </w:p>
-              </w:tc>
-            </w:tr>
-            <w:tr>
-              <w:trPr>
-                <w:cantSplit/>
-                <w:trHeight w:val="907" w:hRule="exact"/>
+                <w:trHeight w:val="1247" w:hRule="exact"/>
               </w:trPr>
               <w:tc>
                 <w:tcPr>
@@ -1771,25 +1260,25 @@
                       <w:b/>
                       <w:bCs/>
                       <w:color w:val="000000"/>
-                      <w:sz w:val="26"/>
-                      <w:szCs w:val="26"/>
+                      <w:sz w:val="30"/>
+                      <w:szCs w:val="30"/>
                     </w:rPr>
                     <w:t xml:space="preserve">ЗАМЕСТИТЕЛЬ</w:t>
                   </w:r>
                 </w:p>
                 <w:p>
                   <w:pPr>
-                    <w:spacing w:after="0" w:before="0" w:line="240"/>
-                    <w:jc w:val="center"/>
-                  </w:pPr>
-                  <w:r>
-                    <w:rPr>
-                      <w:rFonts w:ascii="Arial" w:cs="Arial" w:eastAsia="Arial" w:hAnsi="Arial"/>
-                      <w:b/>
-                      <w:bCs/>
-                      <w:color w:val="000000"/>
-                      <w:sz w:val="26"/>
-                      <w:szCs w:val="26"/>
+                    <w:spacing w:after="0" w:before="40"/>
+                    <w:jc w:val="center"/>
+                  </w:pPr>
+                  <w:r>
+                    <w:rPr>
+                      <w:rFonts w:ascii="Arial" w:cs="Arial" w:eastAsia="Arial" w:hAnsi="Arial"/>
+                      <w:b/>
+                      <w:bCs/>
+                      <w:color w:val="000000"/>
+                      <w:sz w:val="30"/>
+                      <w:szCs w:val="30"/>
                     </w:rPr>
                     <w:t xml:space="preserve">УЧИТЕЛЯ</w:t>
                   </w:r>
@@ -1799,7 +1288,7 @@
             <w:tr>
               <w:trPr>
                 <w:cantSplit/>
-                <w:trHeight w:val="1361" w:hRule="exact"/>
+                <w:trHeight w:val="1814" w:hRule="exact"/>
               </w:trPr>
               <w:tc>
                 <w:tcPr>
@@ -1828,26 +1317,26 @@
                       <w:rFonts w:ascii="Arial" w:cs="Arial" w:eastAsia="Arial" w:hAnsi="Arial"/>
                       <w:b/>
                       <w:bCs/>
-                      <w:color w:val="111111"/>
-                      <w:sz w:val="26"/>
-                      <w:szCs w:val="26"/>
+                      <w:color w:val="000000"/>
+                      <w:sz w:val="32"/>
+                      <w:szCs w:val="32"/>
                     </w:rPr>
                     <w:t xml:space="preserve">Досбаев</w:t>
                   </w:r>
                 </w:p>
                 <w:p>
                   <w:pPr>
-                    <w:spacing w:after="0" w:before="60"/>
-                    <w:jc w:val="center"/>
-                  </w:pPr>
-                  <w:r>
-                    <w:rPr>
-                      <w:rFonts w:ascii="Arial" w:cs="Arial" w:eastAsia="Arial" w:hAnsi="Arial"/>
-                      <w:b/>
-                      <w:bCs/>
-                      <w:color w:val="111111"/>
-                      <w:sz w:val="26"/>
-                      <w:szCs w:val="26"/>
+                    <w:spacing w:after="0" w:before="100"/>
+                    <w:jc w:val="center"/>
+                  </w:pPr>
+                  <w:r>
+                    <w:rPr>
+                      <w:rFonts w:ascii="Arial" w:cs="Arial" w:eastAsia="Arial" w:hAnsi="Arial"/>
+                      <w:b/>
+                      <w:bCs/>
+                      <w:color w:val="000000"/>
+                      <w:sz w:val="32"/>
+                      <w:szCs w:val="32"/>
                     </w:rPr>
                     <w:t xml:space="preserve">Константин</w:t>
                   </w:r>
@@ -1857,7 +1346,7 @@
             <w:tr>
               <w:trPr>
                 <w:cantSplit/>
-                <w:trHeight w:val="510" w:hRule="exact"/>
+                <w:trHeight w:val="794" w:hRule="exact"/>
               </w:trPr>
               <w:tc>
                 <w:tcPr>
@@ -1879,8 +1368,8 @@
                     <w:rPr>
                       <w:rFonts w:ascii="Arial" w:cs="Arial" w:eastAsia="Arial" w:hAnsi="Arial"/>
                       <w:color w:val="333333"/>
-                      <w:sz w:val="17"/>
-                      <w:szCs w:val="17"/>
+                      <w:sz w:val="22"/>
+                      <w:szCs w:val="22"/>
                     </w:rPr>
                     <w:t xml:space="preserve">Предмет: </w:t>
                   </w:r>
@@ -1889,24 +1378,24 @@
                       <w:rFonts w:ascii="Arial" w:cs="Arial" w:eastAsia="Arial" w:hAnsi="Arial"/>
                       <w:b/>
                       <w:bCs/>
-                      <w:color w:val="111111"/>
-                      <w:sz w:val="17"/>
-                      <w:szCs w:val="17"/>
+                      <w:color w:val="000000"/>
+                      <w:sz w:val="22"/>
+                      <w:szCs w:val="22"/>
                     </w:rPr>
                     <w:t xml:space="preserve">музыка</w:t>
                   </w:r>
                 </w:p>
                 <w:p>
                   <w:pPr>
-                    <w:spacing w:after="0" w:before="20"/>
+                    <w:spacing w:after="0" w:before="60"/>
                     <w:jc w:val="center"/>
                   </w:pPr>
                   <w:r>
                     <w:rPr>
                       <w:rFonts w:ascii="Arial" w:cs="Arial" w:eastAsia="Arial" w:hAnsi="Arial"/>
                       <w:color w:val="333333"/>
-                      <w:sz w:val="17"/>
-                      <w:szCs w:val="17"/>
+                      <w:sz w:val="22"/>
+                      <w:szCs w:val="22"/>
                     </w:rPr>
                     <w:t xml:space="preserve">Класс: </w:t>
                   </w:r>
@@ -1915,52 +1404,11 @@
                       <w:rFonts w:ascii="Arial" w:cs="Arial" w:eastAsia="Arial" w:hAnsi="Arial"/>
                       <w:b/>
                       <w:bCs/>
-                      <w:color w:val="111111"/>
-                      <w:sz w:val="17"/>
-                      <w:szCs w:val="17"/>
+                      <w:color w:val="000000"/>
+                      <w:sz w:val="22"/>
+                      <w:szCs w:val="22"/>
                     </w:rPr>
                     <w:t xml:space="preserve">11 «Б»</w:t>
-                  </w:r>
-                </w:p>
-              </w:tc>
-            </w:tr>
-            <w:tr>
-              <w:trPr>
-                <w:cantSplit/>
-                <w:trHeight w:val="397" w:hRule="exact"/>
-              </w:trPr>
-              <w:tc>
-                <w:tcPr>
-                  <w:tcW w:type="dxa" w:w="3119"/>
-                  <w:tcBorders>
-                    <w:top w:val="single" w:color="000000" w:sz="12"/>
-                    <w:left w:val="none" w:color="FFFFFF" w:sz="0"/>
-                    <w:bottom w:val="none" w:color="FFFFFF" w:sz="0"/>
-                    <w:right w:val="none" w:color="FFFFFF" w:sz="0"/>
-                  </w:tcBorders>
-                  <w:tcMar>
-                    <w:top w:type="dxa" w:w="0"/>
-                    <w:left w:type="dxa" w:w="85"/>
-                    <w:bottom w:type="dxa" w:w="0"/>
-                    <w:right w:type="dxa" w:w="85"/>
-                  </w:tcMar>
-                  <w:vAlign w:val="center"/>
-                </w:tcPr>
-                <w:p>
-                  <w:pPr>
-                    <w:spacing w:after="0" w:before="0" w:line="240"/>
-                    <w:jc w:val="center"/>
-                  </w:pPr>
-                  <w:r>
-                    <w:rPr>
-                      <w:rFonts w:ascii="Arial" w:cs="Arial" w:eastAsia="Arial" w:hAnsi="Arial"/>
-                      <w:b/>
-                      <w:bCs/>
-                      <w:color w:val="000000"/>
-                      <w:sz w:val="16"/>
-                      <w:szCs w:val="16"/>
-                    </w:rPr>
-                    <w:t xml:space="preserve">5 октября 2026 г.</w:t>
                   </w:r>
                 </w:p>
               </w:tc>
@@ -2023,58 +1471,7 @@
             <w:tr>
               <w:trPr>
                 <w:cantSplit/>
-                <w:trHeight w:val="680" w:hRule="exact"/>
-              </w:trPr>
-              <w:tc>
-                <w:tcPr>
-                  <w:tcW w:type="dxa" w:w="3119"/>
-                  <w:shd w:fill="000000" w:color="auto" w:val="clear"/>
-                  <w:tcMar>
-                    <w:top w:type="dxa" w:w="0"/>
-                    <w:left w:type="dxa" w:w="85"/>
-                    <w:bottom w:type="dxa" w:w="0"/>
-                    <w:right w:type="dxa" w:w="85"/>
-                  </w:tcMar>
-                  <w:vAlign w:val="center"/>
-                </w:tcPr>
-                <w:p>
-                  <w:pPr>
-                    <w:spacing w:after="0" w:before="0" w:line="240"/>
-                    <w:jc w:val="center"/>
-                  </w:pPr>
-                  <w:r>
-                    <w:rPr>
-                      <w:rFonts w:ascii="Arial" w:cs="Arial" w:eastAsia="Arial" w:hAnsi="Arial"/>
-                      <w:b/>
-                      <w:bCs/>
-                      <w:color w:val="FFFFFF"/>
-                      <w:sz w:val="20"/>
-                      <w:szCs w:val="20"/>
-                    </w:rPr>
-                    <w:t xml:space="preserve">ДЕНЬ САМОУПРАВЛЕНИЯ</w:t>
-                  </w:r>
-                </w:p>
-                <w:p>
-                  <w:pPr>
-                    <w:spacing w:after="0" w:before="40"/>
-                    <w:jc w:val="center"/>
-                  </w:pPr>
-                  <w:r>
-                    <w:rPr>
-                      <w:rFonts w:ascii="Arial" w:cs="Arial" w:eastAsia="Arial" w:hAnsi="Arial"/>
-                      <w:color w:val="FFFFFF"/>
-                      <w:sz w:val="14"/>
-                      <w:szCs w:val="14"/>
-                    </w:rPr>
-                    <w:t xml:space="preserve">Школа № 12</w:t>
-                  </w:r>
-                </w:p>
-              </w:tc>
-            </w:tr>
-            <w:tr>
-              <w:trPr>
-                <w:cantSplit/>
-                <w:trHeight w:val="907" w:hRule="exact"/>
+                <w:trHeight w:val="1247" w:hRule="exact"/>
               </w:trPr>
               <w:tc>
                 <w:tcPr>
@@ -2099,25 +1496,25 @@
                       <w:b/>
                       <w:bCs/>
                       <w:color w:val="000000"/>
-                      <w:sz w:val="26"/>
-                      <w:szCs w:val="26"/>
+                      <w:sz w:val="30"/>
+                      <w:szCs w:val="30"/>
                     </w:rPr>
                     <w:t xml:space="preserve">ЗАМЕСТИТЕЛЬ</w:t>
                   </w:r>
                 </w:p>
                 <w:p>
                   <w:pPr>
-                    <w:spacing w:after="0" w:before="0" w:line="240"/>
-                    <w:jc w:val="center"/>
-                  </w:pPr>
-                  <w:r>
-                    <w:rPr>
-                      <w:rFonts w:ascii="Arial" w:cs="Arial" w:eastAsia="Arial" w:hAnsi="Arial"/>
-                      <w:b/>
-                      <w:bCs/>
-                      <w:color w:val="000000"/>
-                      <w:sz w:val="26"/>
-                      <w:szCs w:val="26"/>
+                    <w:spacing w:after="0" w:before="40"/>
+                    <w:jc w:val="center"/>
+                  </w:pPr>
+                  <w:r>
+                    <w:rPr>
+                      <w:rFonts w:ascii="Arial" w:cs="Arial" w:eastAsia="Arial" w:hAnsi="Arial"/>
+                      <w:b/>
+                      <w:bCs/>
+                      <w:color w:val="000000"/>
+                      <w:sz w:val="30"/>
+                      <w:szCs w:val="30"/>
                     </w:rPr>
                     <w:t xml:space="preserve">УЧИТЕЛЯ</w:t>
                   </w:r>
@@ -2127,7 +1524,7 @@
             <w:tr>
               <w:trPr>
                 <w:cantSplit/>
-                <w:trHeight w:val="1361" w:hRule="exact"/>
+                <w:trHeight w:val="1814" w:hRule="exact"/>
               </w:trPr>
               <w:tc>
                 <w:tcPr>
@@ -2156,26 +1553,26 @@
                       <w:rFonts w:ascii="Arial" w:cs="Arial" w:eastAsia="Arial" w:hAnsi="Arial"/>
                       <w:b/>
                       <w:bCs/>
-                      <w:color w:val="111111"/>
-                      <w:sz w:val="26"/>
-                      <w:szCs w:val="26"/>
+                      <w:color w:val="000000"/>
+                      <w:sz w:val="32"/>
+                      <w:szCs w:val="32"/>
                     </w:rPr>
                     <w:t xml:space="preserve">Досбаев</w:t>
                   </w:r>
                 </w:p>
                 <w:p>
                   <w:pPr>
-                    <w:spacing w:after="0" w:before="60"/>
-                    <w:jc w:val="center"/>
-                  </w:pPr>
-                  <w:r>
-                    <w:rPr>
-                      <w:rFonts w:ascii="Arial" w:cs="Arial" w:eastAsia="Arial" w:hAnsi="Arial"/>
-                      <w:b/>
-                      <w:bCs/>
-                      <w:color w:val="111111"/>
-                      <w:sz w:val="26"/>
-                      <w:szCs w:val="26"/>
+                    <w:spacing w:after="0" w:before="100"/>
+                    <w:jc w:val="center"/>
+                  </w:pPr>
+                  <w:r>
+                    <w:rPr>
+                      <w:rFonts w:ascii="Arial" w:cs="Arial" w:eastAsia="Arial" w:hAnsi="Arial"/>
+                      <w:b/>
+                      <w:bCs/>
+                      <w:color w:val="000000"/>
+                      <w:sz w:val="32"/>
+                      <w:szCs w:val="32"/>
                     </w:rPr>
                     <w:t xml:space="preserve">Константин</w:t>
                   </w:r>
@@ -2185,7 +1582,7 @@
             <w:tr>
               <w:trPr>
                 <w:cantSplit/>
-                <w:trHeight w:val="510" w:hRule="exact"/>
+                <w:trHeight w:val="794" w:hRule="exact"/>
               </w:trPr>
               <w:tc>
                 <w:tcPr>
@@ -2207,8 +1604,8 @@
                     <w:rPr>
                       <w:rFonts w:ascii="Arial" w:cs="Arial" w:eastAsia="Arial" w:hAnsi="Arial"/>
                       <w:color w:val="333333"/>
-                      <w:sz w:val="17"/>
-                      <w:szCs w:val="17"/>
+                      <w:sz w:val="22"/>
+                      <w:szCs w:val="22"/>
                     </w:rPr>
                     <w:t xml:space="preserve">Предмет: </w:t>
                   </w:r>
@@ -2217,24 +1614,24 @@
                       <w:rFonts w:ascii="Arial" w:cs="Arial" w:eastAsia="Arial" w:hAnsi="Arial"/>
                       <w:b/>
                       <w:bCs/>
-                      <w:color w:val="111111"/>
-                      <w:sz w:val="17"/>
-                      <w:szCs w:val="17"/>
+                      <w:color w:val="000000"/>
+                      <w:sz w:val="22"/>
+                      <w:szCs w:val="22"/>
                     </w:rPr>
                     <w:t xml:space="preserve">музыка</w:t>
                   </w:r>
                 </w:p>
                 <w:p>
                   <w:pPr>
-                    <w:spacing w:after="0" w:before="20"/>
+                    <w:spacing w:after="0" w:before="60"/>
                     <w:jc w:val="center"/>
                   </w:pPr>
                   <w:r>
                     <w:rPr>
                       <w:rFonts w:ascii="Arial" w:cs="Arial" w:eastAsia="Arial" w:hAnsi="Arial"/>
                       <w:color w:val="333333"/>
-                      <w:sz w:val="17"/>
-                      <w:szCs w:val="17"/>
+                      <w:sz w:val="22"/>
+                      <w:szCs w:val="22"/>
                     </w:rPr>
                     <w:t xml:space="preserve">Класс: </w:t>
                   </w:r>
@@ -2243,52 +1640,11 @@
                       <w:rFonts w:ascii="Arial" w:cs="Arial" w:eastAsia="Arial" w:hAnsi="Arial"/>
                       <w:b/>
                       <w:bCs/>
-                      <w:color w:val="111111"/>
-                      <w:sz w:val="17"/>
-                      <w:szCs w:val="17"/>
+                      <w:color w:val="000000"/>
+                      <w:sz w:val="22"/>
+                      <w:szCs w:val="22"/>
                     </w:rPr>
                     <w:t xml:space="preserve">11 «Б»</w:t>
-                  </w:r>
-                </w:p>
-              </w:tc>
-            </w:tr>
-            <w:tr>
-              <w:trPr>
-                <w:cantSplit/>
-                <w:trHeight w:val="397" w:hRule="exact"/>
-              </w:trPr>
-              <w:tc>
-                <w:tcPr>
-                  <w:tcW w:type="dxa" w:w="3119"/>
-                  <w:tcBorders>
-                    <w:top w:val="single" w:color="000000" w:sz="12"/>
-                    <w:left w:val="none" w:color="FFFFFF" w:sz="0"/>
-                    <w:bottom w:val="none" w:color="FFFFFF" w:sz="0"/>
-                    <w:right w:val="none" w:color="FFFFFF" w:sz="0"/>
-                  </w:tcBorders>
-                  <w:tcMar>
-                    <w:top w:type="dxa" w:w="0"/>
-                    <w:left w:type="dxa" w:w="85"/>
-                    <w:bottom w:type="dxa" w:w="0"/>
-                    <w:right w:type="dxa" w:w="85"/>
-                  </w:tcMar>
-                  <w:vAlign w:val="center"/>
-                </w:tcPr>
-                <w:p>
-                  <w:pPr>
-                    <w:spacing w:after="0" w:before="0" w:line="240"/>
-                    <w:jc w:val="center"/>
-                  </w:pPr>
-                  <w:r>
-                    <w:rPr>
-                      <w:rFonts w:ascii="Arial" w:cs="Arial" w:eastAsia="Arial" w:hAnsi="Arial"/>
-                      <w:b/>
-                      <w:bCs/>
-                      <w:color w:val="000000"/>
-                      <w:sz w:val="16"/>
-                      <w:szCs w:val="16"/>
-                    </w:rPr>
-                    <w:t xml:space="preserve">5 октября 2026 г.</w:t>
                   </w:r>
                 </w:p>
               </w:tc>
@@ -2345,58 +1701,7 @@
             <w:tr>
               <w:trPr>
                 <w:cantSplit/>
-                <w:trHeight w:val="680" w:hRule="exact"/>
-              </w:trPr>
-              <w:tc>
-                <w:tcPr>
-                  <w:tcW w:type="dxa" w:w="3119"/>
-                  <w:shd w:fill="000000" w:color="auto" w:val="clear"/>
-                  <w:tcMar>
-                    <w:top w:type="dxa" w:w="0"/>
-                    <w:left w:type="dxa" w:w="85"/>
-                    <w:bottom w:type="dxa" w:w="0"/>
-                    <w:right w:type="dxa" w:w="85"/>
-                  </w:tcMar>
-                  <w:vAlign w:val="center"/>
-                </w:tcPr>
-                <w:p>
-                  <w:pPr>
-                    <w:spacing w:after="0" w:before="0" w:line="240"/>
-                    <w:jc w:val="center"/>
-                  </w:pPr>
-                  <w:r>
-                    <w:rPr>
-                      <w:rFonts w:ascii="Arial" w:cs="Arial" w:eastAsia="Arial" w:hAnsi="Arial"/>
-                      <w:b/>
-                      <w:bCs/>
-                      <w:color w:val="FFFFFF"/>
-                      <w:sz w:val="20"/>
-                      <w:szCs w:val="20"/>
-                    </w:rPr>
-                    <w:t xml:space="preserve">ДЕНЬ САМОУПРАВЛЕНИЯ</w:t>
-                  </w:r>
-                </w:p>
-                <w:p>
-                  <w:pPr>
-                    <w:spacing w:after="0" w:before="40"/>
-                    <w:jc w:val="center"/>
-                  </w:pPr>
-                  <w:r>
-                    <w:rPr>
-                      <w:rFonts w:ascii="Arial" w:cs="Arial" w:eastAsia="Arial" w:hAnsi="Arial"/>
-                      <w:color w:val="FFFFFF"/>
-                      <w:sz w:val="14"/>
-                      <w:szCs w:val="14"/>
-                    </w:rPr>
-                    <w:t xml:space="preserve">Школа № 12</w:t>
-                  </w:r>
-                </w:p>
-              </w:tc>
-            </w:tr>
-            <w:tr>
-              <w:trPr>
-                <w:cantSplit/>
-                <w:trHeight w:val="907" w:hRule="exact"/>
+                <w:trHeight w:val="1247" w:hRule="exact"/>
               </w:trPr>
               <w:tc>
                 <w:tcPr>
@@ -2421,25 +1726,25 @@
                       <w:b/>
                       <w:bCs/>
                       <w:color w:val="000000"/>
-                      <w:sz w:val="26"/>
-                      <w:szCs w:val="26"/>
+                      <w:sz w:val="30"/>
+                      <w:szCs w:val="30"/>
                     </w:rPr>
                     <w:t xml:space="preserve">ЗАМЕСТИТЕЛЬ</w:t>
                   </w:r>
                 </w:p>
                 <w:p>
                   <w:pPr>
-                    <w:spacing w:after="0" w:before="0" w:line="240"/>
-                    <w:jc w:val="center"/>
-                  </w:pPr>
-                  <w:r>
-                    <w:rPr>
-                      <w:rFonts w:ascii="Arial" w:cs="Arial" w:eastAsia="Arial" w:hAnsi="Arial"/>
-                      <w:b/>
-                      <w:bCs/>
-                      <w:color w:val="000000"/>
-                      <w:sz w:val="26"/>
-                      <w:szCs w:val="26"/>
+                    <w:spacing w:after="0" w:before="40"/>
+                    <w:jc w:val="center"/>
+                  </w:pPr>
+                  <w:r>
+                    <w:rPr>
+                      <w:rFonts w:ascii="Arial" w:cs="Arial" w:eastAsia="Arial" w:hAnsi="Arial"/>
+                      <w:b/>
+                      <w:bCs/>
+                      <w:color w:val="000000"/>
+                      <w:sz w:val="30"/>
+                      <w:szCs w:val="30"/>
                     </w:rPr>
                     <w:t xml:space="preserve">УЧИТЕЛЯ</w:t>
                   </w:r>
@@ -2449,7 +1754,7 @@
             <w:tr>
               <w:trPr>
                 <w:cantSplit/>
-                <w:trHeight w:val="1361" w:hRule="exact"/>
+                <w:trHeight w:val="1814" w:hRule="exact"/>
               </w:trPr>
               <w:tc>
                 <w:tcPr>
@@ -2478,26 +1783,26 @@
                       <w:rFonts w:ascii="Arial" w:cs="Arial" w:eastAsia="Arial" w:hAnsi="Arial"/>
                       <w:b/>
                       <w:bCs/>
-                      <w:color w:val="111111"/>
-                      <w:sz w:val="26"/>
-                      <w:szCs w:val="26"/>
+                      <w:color w:val="000000"/>
+                      <w:sz w:val="32"/>
+                      <w:szCs w:val="32"/>
                     </w:rPr>
                     <w:t xml:space="preserve">Досбаев</w:t>
                   </w:r>
                 </w:p>
                 <w:p>
                   <w:pPr>
-                    <w:spacing w:after="0" w:before="60"/>
-                    <w:jc w:val="center"/>
-                  </w:pPr>
-                  <w:r>
-                    <w:rPr>
-                      <w:rFonts w:ascii="Arial" w:cs="Arial" w:eastAsia="Arial" w:hAnsi="Arial"/>
-                      <w:b/>
-                      <w:bCs/>
-                      <w:color w:val="111111"/>
-                      <w:sz w:val="26"/>
-                      <w:szCs w:val="26"/>
+                    <w:spacing w:after="0" w:before="100"/>
+                    <w:jc w:val="center"/>
+                  </w:pPr>
+                  <w:r>
+                    <w:rPr>
+                      <w:rFonts w:ascii="Arial" w:cs="Arial" w:eastAsia="Arial" w:hAnsi="Arial"/>
+                      <w:b/>
+                      <w:bCs/>
+                      <w:color w:val="000000"/>
+                      <w:sz w:val="32"/>
+                      <w:szCs w:val="32"/>
                     </w:rPr>
                     <w:t xml:space="preserve">Константин</w:t>
                   </w:r>
@@ -2507,7 +1812,7 @@
             <w:tr>
               <w:trPr>
                 <w:cantSplit/>
-                <w:trHeight w:val="510" w:hRule="exact"/>
+                <w:trHeight w:val="794" w:hRule="exact"/>
               </w:trPr>
               <w:tc>
                 <w:tcPr>
@@ -2529,8 +1834,8 @@
                     <w:rPr>
                       <w:rFonts w:ascii="Arial" w:cs="Arial" w:eastAsia="Arial" w:hAnsi="Arial"/>
                       <w:color w:val="333333"/>
-                      <w:sz w:val="17"/>
-                      <w:szCs w:val="17"/>
+                      <w:sz w:val="22"/>
+                      <w:szCs w:val="22"/>
                     </w:rPr>
                     <w:t xml:space="preserve">Предмет: </w:t>
                   </w:r>
@@ -2539,24 +1844,24 @@
                       <w:rFonts w:ascii="Arial" w:cs="Arial" w:eastAsia="Arial" w:hAnsi="Arial"/>
                       <w:b/>
                       <w:bCs/>
-                      <w:color w:val="111111"/>
-                      <w:sz w:val="17"/>
-                      <w:szCs w:val="17"/>
+                      <w:color w:val="000000"/>
+                      <w:sz w:val="22"/>
+                      <w:szCs w:val="22"/>
                     </w:rPr>
                     <w:t xml:space="preserve">музыка</w:t>
                   </w:r>
                 </w:p>
                 <w:p>
                   <w:pPr>
-                    <w:spacing w:after="0" w:before="20"/>
+                    <w:spacing w:after="0" w:before="60"/>
                     <w:jc w:val="center"/>
                   </w:pPr>
                   <w:r>
                     <w:rPr>
                       <w:rFonts w:ascii="Arial" w:cs="Arial" w:eastAsia="Arial" w:hAnsi="Arial"/>
                       <w:color w:val="333333"/>
-                      <w:sz w:val="17"/>
-                      <w:szCs w:val="17"/>
+                      <w:sz w:val="22"/>
+                      <w:szCs w:val="22"/>
                     </w:rPr>
                     <w:t xml:space="preserve">Класс: </w:t>
                   </w:r>
@@ -2565,52 +1870,11 @@
                       <w:rFonts w:ascii="Arial" w:cs="Arial" w:eastAsia="Arial" w:hAnsi="Arial"/>
                       <w:b/>
                       <w:bCs/>
-                      <w:color w:val="111111"/>
-                      <w:sz w:val="17"/>
-                      <w:szCs w:val="17"/>
+                      <w:color w:val="000000"/>
+                      <w:sz w:val="22"/>
+                      <w:szCs w:val="22"/>
                     </w:rPr>
                     <w:t xml:space="preserve">11 «Б»</w:t>
-                  </w:r>
-                </w:p>
-              </w:tc>
-            </w:tr>
-            <w:tr>
-              <w:trPr>
-                <w:cantSplit/>
-                <w:trHeight w:val="397" w:hRule="exact"/>
-              </w:trPr>
-              <w:tc>
-                <w:tcPr>
-                  <w:tcW w:type="dxa" w:w="3119"/>
-                  <w:tcBorders>
-                    <w:top w:val="single" w:color="000000" w:sz="12"/>
-                    <w:left w:val="none" w:color="FFFFFF" w:sz="0"/>
-                    <w:bottom w:val="none" w:color="FFFFFF" w:sz="0"/>
-                    <w:right w:val="none" w:color="FFFFFF" w:sz="0"/>
-                  </w:tcBorders>
-                  <w:tcMar>
-                    <w:top w:type="dxa" w:w="0"/>
-                    <w:left w:type="dxa" w:w="85"/>
-                    <w:bottom w:type="dxa" w:w="0"/>
-                    <w:right w:type="dxa" w:w="85"/>
-                  </w:tcMar>
-                  <w:vAlign w:val="center"/>
-                </w:tcPr>
-                <w:p>
-                  <w:pPr>
-                    <w:spacing w:after="0" w:before="0" w:line="240"/>
-                    <w:jc w:val="center"/>
-                  </w:pPr>
-                  <w:r>
-                    <w:rPr>
-                      <w:rFonts w:ascii="Arial" w:cs="Arial" w:eastAsia="Arial" w:hAnsi="Arial"/>
-                      <w:b/>
-                      <w:bCs/>
-                      <w:color w:val="000000"/>
-                      <w:sz w:val="16"/>
-                      <w:szCs w:val="16"/>
-                    </w:rPr>
-                    <w:t xml:space="preserve">5 октября 2026 г.</w:t>
                   </w:r>
                 </w:p>
               </w:tc>
@@ -2667,58 +1931,7 @@
             <w:tr>
               <w:trPr>
                 <w:cantSplit/>
-                <w:trHeight w:val="680" w:hRule="exact"/>
-              </w:trPr>
-              <w:tc>
-                <w:tcPr>
-                  <w:tcW w:type="dxa" w:w="3119"/>
-                  <w:shd w:fill="000000" w:color="auto" w:val="clear"/>
-                  <w:tcMar>
-                    <w:top w:type="dxa" w:w="0"/>
-                    <w:left w:type="dxa" w:w="85"/>
-                    <w:bottom w:type="dxa" w:w="0"/>
-                    <w:right w:type="dxa" w:w="85"/>
-                  </w:tcMar>
-                  <w:vAlign w:val="center"/>
-                </w:tcPr>
-                <w:p>
-                  <w:pPr>
-                    <w:spacing w:after="0" w:before="0" w:line="240"/>
-                    <w:jc w:val="center"/>
-                  </w:pPr>
-                  <w:r>
-                    <w:rPr>
-                      <w:rFonts w:ascii="Arial" w:cs="Arial" w:eastAsia="Arial" w:hAnsi="Arial"/>
-                      <w:b/>
-                      <w:bCs/>
-                      <w:color w:val="FFFFFF"/>
-                      <w:sz w:val="20"/>
-                      <w:szCs w:val="20"/>
-                    </w:rPr>
-                    <w:t xml:space="preserve">ДЕНЬ САМОУПРАВЛЕНИЯ</w:t>
-                  </w:r>
-                </w:p>
-                <w:p>
-                  <w:pPr>
-                    <w:spacing w:after="0" w:before="40"/>
-                    <w:jc w:val="center"/>
-                  </w:pPr>
-                  <w:r>
-                    <w:rPr>
-                      <w:rFonts w:ascii="Arial" w:cs="Arial" w:eastAsia="Arial" w:hAnsi="Arial"/>
-                      <w:color w:val="FFFFFF"/>
-                      <w:sz w:val="14"/>
-                      <w:szCs w:val="14"/>
-                    </w:rPr>
-                    <w:t xml:space="preserve">Школа № 12</w:t>
-                  </w:r>
-                </w:p>
-              </w:tc>
-            </w:tr>
-            <w:tr>
-              <w:trPr>
-                <w:cantSplit/>
-                <w:trHeight w:val="907" w:hRule="exact"/>
+                <w:trHeight w:val="1247" w:hRule="exact"/>
               </w:trPr>
               <w:tc>
                 <w:tcPr>
@@ -2743,25 +1956,25 @@
                       <w:b/>
                       <w:bCs/>
                       <w:color w:val="000000"/>
-                      <w:sz w:val="26"/>
-                      <w:szCs w:val="26"/>
+                      <w:sz w:val="30"/>
+                      <w:szCs w:val="30"/>
                     </w:rPr>
                     <w:t xml:space="preserve">ЗАМЕСТИТЕЛЬ</w:t>
                   </w:r>
                 </w:p>
                 <w:p>
                   <w:pPr>
-                    <w:spacing w:after="0" w:before="0" w:line="240"/>
-                    <w:jc w:val="center"/>
-                  </w:pPr>
-                  <w:r>
-                    <w:rPr>
-                      <w:rFonts w:ascii="Arial" w:cs="Arial" w:eastAsia="Arial" w:hAnsi="Arial"/>
-                      <w:b/>
-                      <w:bCs/>
-                      <w:color w:val="000000"/>
-                      <w:sz w:val="26"/>
-                      <w:szCs w:val="26"/>
+                    <w:spacing w:after="0" w:before="40"/>
+                    <w:jc w:val="center"/>
+                  </w:pPr>
+                  <w:r>
+                    <w:rPr>
+                      <w:rFonts w:ascii="Arial" w:cs="Arial" w:eastAsia="Arial" w:hAnsi="Arial"/>
+                      <w:b/>
+                      <w:bCs/>
+                      <w:color w:val="000000"/>
+                      <w:sz w:val="30"/>
+                      <w:szCs w:val="30"/>
                     </w:rPr>
                     <w:t xml:space="preserve">УЧИТЕЛЯ</w:t>
                   </w:r>
@@ -2771,7 +1984,7 @@
             <w:tr>
               <w:trPr>
                 <w:cantSplit/>
-                <w:trHeight w:val="1361" w:hRule="exact"/>
+                <w:trHeight w:val="1814" w:hRule="exact"/>
               </w:trPr>
               <w:tc>
                 <w:tcPr>
@@ -2800,26 +2013,26 @@
                       <w:rFonts w:ascii="Arial" w:cs="Arial" w:eastAsia="Arial" w:hAnsi="Arial"/>
                       <w:b/>
                       <w:bCs/>
-                      <w:color w:val="111111"/>
-                      <w:sz w:val="26"/>
-                      <w:szCs w:val="26"/>
+                      <w:color w:val="000000"/>
+                      <w:sz w:val="32"/>
+                      <w:szCs w:val="32"/>
                     </w:rPr>
                     <w:t xml:space="preserve">Досбаев</w:t>
                   </w:r>
                 </w:p>
                 <w:p>
                   <w:pPr>
-                    <w:spacing w:after="0" w:before="60"/>
-                    <w:jc w:val="center"/>
-                  </w:pPr>
-                  <w:r>
-                    <w:rPr>
-                      <w:rFonts w:ascii="Arial" w:cs="Arial" w:eastAsia="Arial" w:hAnsi="Arial"/>
-                      <w:b/>
-                      <w:bCs/>
-                      <w:color w:val="111111"/>
-                      <w:sz w:val="26"/>
-                      <w:szCs w:val="26"/>
+                    <w:spacing w:after="0" w:before="100"/>
+                    <w:jc w:val="center"/>
+                  </w:pPr>
+                  <w:r>
+                    <w:rPr>
+                      <w:rFonts w:ascii="Arial" w:cs="Arial" w:eastAsia="Arial" w:hAnsi="Arial"/>
+                      <w:b/>
+                      <w:bCs/>
+                      <w:color w:val="000000"/>
+                      <w:sz w:val="32"/>
+                      <w:szCs w:val="32"/>
                     </w:rPr>
                     <w:t xml:space="preserve">Константин</w:t>
                   </w:r>
@@ -2829,7 +2042,7 @@
             <w:tr>
               <w:trPr>
                 <w:cantSplit/>
-                <w:trHeight w:val="510" w:hRule="exact"/>
+                <w:trHeight w:val="794" w:hRule="exact"/>
               </w:trPr>
               <w:tc>
                 <w:tcPr>
@@ -2851,8 +2064,8 @@
                     <w:rPr>
                       <w:rFonts w:ascii="Arial" w:cs="Arial" w:eastAsia="Arial" w:hAnsi="Arial"/>
                       <w:color w:val="333333"/>
-                      <w:sz w:val="17"/>
-                      <w:szCs w:val="17"/>
+                      <w:sz w:val="22"/>
+                      <w:szCs w:val="22"/>
                     </w:rPr>
                     <w:t xml:space="preserve">Предмет: </w:t>
                   </w:r>
@@ -2861,24 +2074,24 @@
                       <w:rFonts w:ascii="Arial" w:cs="Arial" w:eastAsia="Arial" w:hAnsi="Arial"/>
                       <w:b/>
                       <w:bCs/>
-                      <w:color w:val="111111"/>
-                      <w:sz w:val="17"/>
-                      <w:szCs w:val="17"/>
+                      <w:color w:val="000000"/>
+                      <w:sz w:val="22"/>
+                      <w:szCs w:val="22"/>
                     </w:rPr>
                     <w:t xml:space="preserve">музыка</w:t>
                   </w:r>
                 </w:p>
                 <w:p>
                   <w:pPr>
-                    <w:spacing w:after="0" w:before="20"/>
+                    <w:spacing w:after="0" w:before="60"/>
                     <w:jc w:val="center"/>
                   </w:pPr>
                   <w:r>
                     <w:rPr>
                       <w:rFonts w:ascii="Arial" w:cs="Arial" w:eastAsia="Arial" w:hAnsi="Arial"/>
                       <w:color w:val="333333"/>
-                      <w:sz w:val="17"/>
-                      <w:szCs w:val="17"/>
+                      <w:sz w:val="22"/>
+                      <w:szCs w:val="22"/>
                     </w:rPr>
                     <w:t xml:space="preserve">Класс: </w:t>
                   </w:r>
@@ -2887,52 +2100,11 @@
                       <w:rFonts w:ascii="Arial" w:cs="Arial" w:eastAsia="Arial" w:hAnsi="Arial"/>
                       <w:b/>
                       <w:bCs/>
-                      <w:color w:val="111111"/>
-                      <w:sz w:val="17"/>
-                      <w:szCs w:val="17"/>
+                      <w:color w:val="000000"/>
+                      <w:sz w:val="22"/>
+                      <w:szCs w:val="22"/>
                     </w:rPr>
                     <w:t xml:space="preserve">11 «Б»</w:t>
-                  </w:r>
-                </w:p>
-              </w:tc>
-            </w:tr>
-            <w:tr>
-              <w:trPr>
-                <w:cantSplit/>
-                <w:trHeight w:val="397" w:hRule="exact"/>
-              </w:trPr>
-              <w:tc>
-                <w:tcPr>
-                  <w:tcW w:type="dxa" w:w="3119"/>
-                  <w:tcBorders>
-                    <w:top w:val="single" w:color="000000" w:sz="12"/>
-                    <w:left w:val="none" w:color="FFFFFF" w:sz="0"/>
-                    <w:bottom w:val="none" w:color="FFFFFF" w:sz="0"/>
-                    <w:right w:val="none" w:color="FFFFFF" w:sz="0"/>
-                  </w:tcBorders>
-                  <w:tcMar>
-                    <w:top w:type="dxa" w:w="0"/>
-                    <w:left w:type="dxa" w:w="85"/>
-                    <w:bottom w:type="dxa" w:w="0"/>
-                    <w:right w:type="dxa" w:w="85"/>
-                  </w:tcMar>
-                  <w:vAlign w:val="center"/>
-                </w:tcPr>
-                <w:p>
-                  <w:pPr>
-                    <w:spacing w:after="0" w:before="0" w:line="240"/>
-                    <w:jc w:val="center"/>
-                  </w:pPr>
-                  <w:r>
-                    <w:rPr>
-                      <w:rFonts w:ascii="Arial" w:cs="Arial" w:eastAsia="Arial" w:hAnsi="Arial"/>
-                      <w:b/>
-                      <w:bCs/>
-                      <w:color w:val="000000"/>
-                      <w:sz w:val="16"/>
-                      <w:szCs w:val="16"/>
-                    </w:rPr>
-                    <w:t xml:space="preserve">5 октября 2026 г.</w:t>
                   </w:r>
                 </w:p>
               </w:tc>

</xml_diff>